<commit_message>
Implemented link navigation to the Extra Time Request and Regularization Request from the action buttons in the Attendance Dashboard
</commit_message>
<xml_diff>
--- a/Documentation/AI Prompts/Vibe Coding - Recruitment Management page.docx
+++ b/Documentation/AI Prompts/Vibe Coding - Recruitment Management page.docx
@@ -2635,16 +2635,7 @@
           <w:color w:val="EE0000"/>
           <w:u w:val="single"/>
         </w:rPr>
-        <w:t xml:space="preserve"> #</w:t>
-      </w:r>
-      <w:r>
-        <w:rPr>
-          <w:b/>
-          <w:bCs/>
-          <w:color w:val="EE0000"/>
-          <w:u w:val="single"/>
-        </w:rPr>
-        <w:t>3</w:t>
+        <w:t xml:space="preserve"> #3</w:t>
       </w:r>
       <w:r>
         <w:rPr>
@@ -3085,6 +3076,4540 @@
         <w:t xml:space="preserve"> version 8.8.0</w:t>
       </w:r>
     </w:p>
+    <w:p>
+      <w:pPr>
+        <w:rPr>
+          <w:b/>
+          <w:bCs/>
+          <w:color w:val="EE0000"/>
+          <w:u w:val="single"/>
+        </w:rPr>
+      </w:pPr>
+      <w:r>
+        <w:rPr>
+          <w:b/>
+          <w:bCs/>
+          <w:color w:val="EE0000"/>
+          <w:u w:val="single"/>
+        </w:rPr>
+        <w:t>Prompt #4:</w:t>
+      </w:r>
+    </w:p>
+    <w:p>
+      <w:r>
+        <w:t>Below is the Blazor code for rendering the recruitment budget grid. In the Actions template column, the icon buttons are displayed not vertically-aligned center on the grid rows and there is a line that shown at the bottom, which does not appear aligned to the lines that separate each row in the grid. Tell me how to fix this issue.</w:t>
+      </w:r>
+    </w:p>
+    <w:p>
+      <w:pPr>
+        <w:spacing w:after="0"/>
+      </w:pPr>
+      <w:r>
+        <w:t>&lt;</w:t>
+      </w:r>
+      <w:proofErr w:type="spellStart"/>
+      <w:r>
+        <w:t>MudPaper</w:t>
+      </w:r>
+      <w:proofErr w:type="spellEnd"/>
+      <w:r>
+        <w:t xml:space="preserve"> Elevation="5" Square="true" Class="w-100 mb-3"&gt;</w:t>
+      </w:r>
+    </w:p>
+    <w:p>
+      <w:pPr>
+        <w:spacing w:after="0"/>
+      </w:pPr>
+      <w:r>
+        <w:t xml:space="preserve">    &lt;</w:t>
+      </w:r>
+      <w:proofErr w:type="spellStart"/>
+      <w:r>
+        <w:t>MudDataGrid</w:t>
+      </w:r>
+      <w:proofErr w:type="spellEnd"/>
+      <w:r>
+        <w:t xml:space="preserve"> T="</w:t>
+      </w:r>
+      <w:proofErr w:type="spellStart"/>
+      <w:r>
+        <w:t>RecruitmentBudgetDTO</w:t>
+      </w:r>
+      <w:proofErr w:type="spellEnd"/>
+      <w:r>
+        <w:t>" Items="@_</w:t>
+      </w:r>
+      <w:proofErr w:type="spellStart"/>
+      <w:r>
+        <w:t>budgetList</w:t>
+      </w:r>
+      <w:proofErr w:type="spellEnd"/>
+      <w:r>
+        <w:t xml:space="preserve">" Hover="true" Striped="true" Class="budget-grid" </w:t>
+      </w:r>
+    </w:p>
+    <w:p>
+      <w:pPr>
+        <w:spacing w:after="0"/>
+      </w:pPr>
+      <w:r>
+        <w:t xml:space="preserve">        Filterable="_</w:t>
+      </w:r>
+      <w:proofErr w:type="spellStart"/>
+      <w:r>
+        <w:t>enableFilter</w:t>
+      </w:r>
+      <w:proofErr w:type="spellEnd"/>
+      <w:r>
+        <w:t xml:space="preserve">" </w:t>
+      </w:r>
+      <w:proofErr w:type="spellStart"/>
+      <w:r>
+        <w:t>FilterMode</w:t>
+      </w:r>
+      <w:proofErr w:type="spellEnd"/>
+      <w:r>
+        <w:t>="@</w:t>
+      </w:r>
+      <w:proofErr w:type="spellStart"/>
+      <w:r>
+        <w:t>DataGridFilterMode.ColumnFilterMenu</w:t>
+      </w:r>
+      <w:proofErr w:type="spellEnd"/>
+      <w:r>
+        <w:t>" FilterCaseSensitivity="@DataGridFilterCaseSensitivity.CaseInsensitive"</w:t>
+      </w:r>
+    </w:p>
+    <w:p>
+      <w:pPr>
+        <w:spacing w:after="0"/>
+      </w:pPr>
+      <w:r>
+        <w:t xml:space="preserve">        </w:t>
+      </w:r>
+      <w:proofErr w:type="spellStart"/>
+      <w:r>
+        <w:t>QuickFilter</w:t>
+      </w:r>
+      <w:proofErr w:type="spellEnd"/>
+      <w:r>
+        <w:t>="@_</w:t>
+      </w:r>
+      <w:proofErr w:type="spellStart"/>
+      <w:r>
+        <w:t>quickFilter</w:t>
+      </w:r>
+      <w:proofErr w:type="spellEnd"/>
+      <w:r>
+        <w:t xml:space="preserve">" </w:t>
+      </w:r>
+      <w:proofErr w:type="spellStart"/>
+      <w:r>
+        <w:t>Hideable</w:t>
+      </w:r>
+      <w:proofErr w:type="spellEnd"/>
+      <w:r>
+        <w:t xml:space="preserve">="true" </w:t>
+      </w:r>
+      <w:proofErr w:type="spellStart"/>
+      <w:r>
+        <w:t>PageSize</w:t>
+      </w:r>
+      <w:proofErr w:type="spellEnd"/>
+      <w:r>
+        <w:t>="5"</w:t>
+      </w:r>
+    </w:p>
+    <w:p>
+      <w:pPr>
+        <w:spacing w:after="0"/>
+      </w:pPr>
+      <w:r>
+        <w:t xml:space="preserve">        </w:t>
+      </w:r>
+      <w:proofErr w:type="spellStart"/>
+      <w:r>
+        <w:t>EditTrigger</w:t>
+      </w:r>
+      <w:proofErr w:type="spellEnd"/>
+      <w:r>
+        <w:t>="</w:t>
+      </w:r>
+      <w:proofErr w:type="spellStart"/>
+      <w:r>
+        <w:t>DataGridEditTrigger.Manual</w:t>
+      </w:r>
+      <w:proofErr w:type="spellEnd"/>
+      <w:r>
+        <w:t xml:space="preserve">" </w:t>
+      </w:r>
+      <w:proofErr w:type="spellStart"/>
+      <w:r>
+        <w:t>ReadOnly</w:t>
+      </w:r>
+      <w:proofErr w:type="spellEnd"/>
+      <w:r>
+        <w:t xml:space="preserve">="false" </w:t>
+      </w:r>
+      <w:proofErr w:type="spellStart"/>
+      <w:r>
+        <w:t>EditMode</w:t>
+      </w:r>
+      <w:proofErr w:type="spellEnd"/>
+      <w:r>
+        <w:t>="</w:t>
+      </w:r>
+      <w:proofErr w:type="spellStart"/>
+      <w:r>
+        <w:t>DataGridEditMode.Form</w:t>
+      </w:r>
+      <w:proofErr w:type="spellEnd"/>
+      <w:r>
+        <w:t>"</w:t>
+      </w:r>
+    </w:p>
+    <w:p>
+      <w:pPr>
+        <w:spacing w:after="0"/>
+      </w:pPr>
+      <w:r>
+        <w:t xml:space="preserve">        </w:t>
+      </w:r>
+      <w:proofErr w:type="spellStart"/>
+      <w:r>
+        <w:t>EditDialogOptions</w:t>
+      </w:r>
+      <w:proofErr w:type="spellEnd"/>
+      <w:r>
+        <w:t xml:space="preserve">="new </w:t>
+      </w:r>
+      <w:proofErr w:type="spellStart"/>
+      <w:r>
+        <w:t>DialogOptions</w:t>
+      </w:r>
+      <w:proofErr w:type="spellEnd"/>
+      <w:r>
+        <w:t xml:space="preserve"> </w:t>
+      </w:r>
+    </w:p>
+    <w:p>
+      <w:pPr>
+        <w:spacing w:after="0"/>
+      </w:pPr>
+      <w:r>
+        <w:t xml:space="preserve">        { </w:t>
+      </w:r>
+    </w:p>
+    <w:p>
+      <w:pPr>
+        <w:spacing w:after="0"/>
+      </w:pPr>
+      <w:r>
+        <w:t xml:space="preserve">            </w:t>
+      </w:r>
+      <w:proofErr w:type="spellStart"/>
+      <w:r>
+        <w:t>MaxWidth</w:t>
+      </w:r>
+      <w:proofErr w:type="spellEnd"/>
+      <w:r>
+        <w:t xml:space="preserve"> = </w:t>
+      </w:r>
+      <w:proofErr w:type="spellStart"/>
+      <w:r>
+        <w:t>MaxWidth.Medium</w:t>
+      </w:r>
+      <w:proofErr w:type="spellEnd"/>
+      <w:r>
+        <w:t xml:space="preserve">, </w:t>
+      </w:r>
+    </w:p>
+    <w:p>
+      <w:pPr>
+        <w:spacing w:after="0"/>
+      </w:pPr>
+      <w:r>
+        <w:t xml:space="preserve">            </w:t>
+      </w:r>
+      <w:proofErr w:type="spellStart"/>
+      <w:r>
+        <w:t>FullWidth</w:t>
+      </w:r>
+      <w:proofErr w:type="spellEnd"/>
+      <w:r>
+        <w:t xml:space="preserve"> = true,</w:t>
+      </w:r>
+    </w:p>
+    <w:p>
+      <w:pPr>
+        <w:spacing w:after="0"/>
+      </w:pPr>
+      <w:r>
+        <w:t xml:space="preserve">            </w:t>
+      </w:r>
+      <w:proofErr w:type="spellStart"/>
+      <w:r>
+        <w:t>BackdropClick</w:t>
+      </w:r>
+      <w:proofErr w:type="spellEnd"/>
+      <w:r>
+        <w:t xml:space="preserve"> = false,</w:t>
+      </w:r>
+    </w:p>
+    <w:p>
+      <w:pPr>
+        <w:spacing w:after="0"/>
+      </w:pPr>
+      <w:r>
+        <w:t xml:space="preserve">            </w:t>
+      </w:r>
+      <w:proofErr w:type="spellStart"/>
+      <w:r>
+        <w:t>CloseOnEscapeKey</w:t>
+      </w:r>
+      <w:proofErr w:type="spellEnd"/>
+      <w:r>
+        <w:t xml:space="preserve"> = false</w:t>
+      </w:r>
+    </w:p>
+    <w:p>
+      <w:pPr>
+        <w:spacing w:after="0"/>
+      </w:pPr>
+      <w:r>
+        <w:t xml:space="preserve">        }"</w:t>
+      </w:r>
+    </w:p>
+    <w:p>
+      <w:pPr>
+        <w:spacing w:after="0"/>
+      </w:pPr>
+      <w:r>
+        <w:t xml:space="preserve">        </w:t>
+      </w:r>
+      <w:proofErr w:type="spellStart"/>
+      <w:r>
+        <w:t>StartedEditingItem</w:t>
+      </w:r>
+      <w:proofErr w:type="spellEnd"/>
+      <w:r>
+        <w:t>="@</w:t>
+      </w:r>
+      <w:proofErr w:type="spellStart"/>
+      <w:r>
+        <w:t>StartedEditingItem</w:t>
+      </w:r>
+      <w:proofErr w:type="spellEnd"/>
+      <w:r>
+        <w:t>"</w:t>
+      </w:r>
+    </w:p>
+    <w:p>
+      <w:pPr>
+        <w:spacing w:after="0"/>
+      </w:pPr>
+      <w:r>
+        <w:t xml:space="preserve">        </w:t>
+      </w:r>
+      <w:proofErr w:type="spellStart"/>
+      <w:r>
+        <w:t>CommittedItemChanges</w:t>
+      </w:r>
+      <w:proofErr w:type="spellEnd"/>
+      <w:r>
+        <w:t>="@</w:t>
+      </w:r>
+      <w:proofErr w:type="spellStart"/>
+      <w:r>
+        <w:t>CommittedItemChanges</w:t>
+      </w:r>
+      <w:proofErr w:type="spellEnd"/>
+      <w:r>
+        <w:t>"</w:t>
+      </w:r>
+    </w:p>
+    <w:p>
+      <w:pPr>
+        <w:spacing w:after="0"/>
+      </w:pPr>
+      <w:r>
+        <w:t xml:space="preserve">        </w:t>
+      </w:r>
+      <w:proofErr w:type="spellStart"/>
+      <w:r>
+        <w:t>TableLayout</w:t>
+      </w:r>
+      <w:proofErr w:type="spellEnd"/>
+      <w:r>
+        <w:t>="</w:t>
+      </w:r>
+      <w:proofErr w:type="spellStart"/>
+      <w:r>
+        <w:t>TableLayout.Fixed</w:t>
+      </w:r>
+      <w:proofErr w:type="spellEnd"/>
+      <w:r>
+        <w:t xml:space="preserve">" Bordered="false" Dense="true" </w:t>
+      </w:r>
+      <w:proofErr w:type="spellStart"/>
+      <w:r>
+        <w:t>ColumnResizeMode</w:t>
+      </w:r>
+      <w:proofErr w:type="spellEnd"/>
+      <w:r>
+        <w:t>="</w:t>
+      </w:r>
+      <w:proofErr w:type="spellStart"/>
+      <w:r>
+        <w:t>ResizeMode.Column</w:t>
+      </w:r>
+      <w:proofErr w:type="spellEnd"/>
+      <w:r>
+        <w:t xml:space="preserve">" </w:t>
+      </w:r>
+      <w:proofErr w:type="spellStart"/>
+      <w:r>
+        <w:t>HorizontalScrollbar</w:t>
+      </w:r>
+      <w:proofErr w:type="spellEnd"/>
+      <w:r>
+        <w:t>="true"&gt;</w:t>
+      </w:r>
+    </w:p>
+    <w:p>
+      <w:pPr>
+        <w:spacing w:after="0"/>
+      </w:pPr>
+      <w:r>
+        <w:t xml:space="preserve">            &lt;</w:t>
+      </w:r>
+      <w:proofErr w:type="spellStart"/>
+      <w:r>
+        <w:t>ToolBarContent</w:t>
+      </w:r>
+      <w:proofErr w:type="spellEnd"/>
+      <w:r>
+        <w:t xml:space="preserve">&gt;                        </w:t>
+      </w:r>
+    </w:p>
+    <w:p>
+      <w:pPr>
+        <w:spacing w:after="0"/>
+      </w:pPr>
+      <w:r>
+        <w:lastRenderedPageBreak/>
+        <w:t xml:space="preserve">                &lt;</w:t>
+      </w:r>
+      <w:proofErr w:type="spellStart"/>
+      <w:r>
+        <w:t>MudPaper</w:t>
+      </w:r>
+      <w:proofErr w:type="spellEnd"/>
+      <w:r>
+        <w:t xml:space="preserve"> Class="d-flex justify-content-start m-0 p-0" Elevation="0"&gt;</w:t>
+      </w:r>
+    </w:p>
+    <w:p>
+      <w:pPr>
+        <w:spacing w:after="0"/>
+      </w:pPr>
+      <w:r>
+        <w:t xml:space="preserve">                    &lt;</w:t>
+      </w:r>
+      <w:proofErr w:type="spellStart"/>
+      <w:r>
+        <w:t>MudTextField</w:t>
+      </w:r>
+      <w:proofErr w:type="spellEnd"/>
+      <w:r>
+        <w:t xml:space="preserve"> @bind-Value="_searchString" Placeholder="Enter search string" Adornment="</w:t>
+      </w:r>
+      <w:proofErr w:type="spellStart"/>
+      <w:r>
+        <w:t>Adornment.Start</w:t>
+      </w:r>
+      <w:proofErr w:type="spellEnd"/>
+      <w:r>
+        <w:t>"</w:t>
+      </w:r>
+    </w:p>
+    <w:p>
+      <w:pPr>
+        <w:spacing w:after="0"/>
+      </w:pPr>
+      <w:r>
+        <w:t xml:space="preserve">                                Immediate="true" Style="width:400px;" Typo="Typo.subtitle1"   </w:t>
+      </w:r>
+    </w:p>
+    <w:p>
+      <w:pPr>
+        <w:spacing w:after="0"/>
+      </w:pPr>
+      <w:r>
+        <w:t xml:space="preserve">                                </w:t>
+      </w:r>
+      <w:proofErr w:type="spellStart"/>
+      <w:r>
+        <w:t>AdornmentIcon</w:t>
+      </w:r>
+      <w:proofErr w:type="spellEnd"/>
+      <w:r>
+        <w:t>="@</w:t>
+      </w:r>
+      <w:proofErr w:type="spellStart"/>
+      <w:proofErr w:type="gramStart"/>
+      <w:r>
+        <w:t>Icons.Material.Filled.Search</w:t>
+      </w:r>
+      <w:proofErr w:type="spellEnd"/>
+      <w:proofErr w:type="gramEnd"/>
+      <w:r>
+        <w:t xml:space="preserve">" </w:t>
+      </w:r>
+      <w:proofErr w:type="spellStart"/>
+      <w:r>
+        <w:t>IconSize</w:t>
+      </w:r>
+      <w:proofErr w:type="spellEnd"/>
+      <w:r>
+        <w:t>="</w:t>
+      </w:r>
+      <w:proofErr w:type="spellStart"/>
+      <w:r>
+        <w:t>Size.Small</w:t>
+      </w:r>
+      <w:proofErr w:type="spellEnd"/>
+      <w:r>
+        <w:t>" Class="mt-0"&gt;</w:t>
+      </w:r>
+    </w:p>
+    <w:p>
+      <w:pPr>
+        <w:spacing w:after="0"/>
+      </w:pPr>
+      <w:r>
+        <w:t xml:space="preserve">                    &lt;/</w:t>
+      </w:r>
+      <w:proofErr w:type="spellStart"/>
+      <w:r>
+        <w:t>MudTextField</w:t>
+      </w:r>
+      <w:proofErr w:type="spellEnd"/>
+      <w:r>
+        <w:t>&gt;</w:t>
+      </w:r>
+    </w:p>
+    <w:p>
+      <w:pPr>
+        <w:spacing w:after="0"/>
+      </w:pPr>
+      <w:r>
+        <w:t xml:space="preserve">                &lt;/</w:t>
+      </w:r>
+      <w:proofErr w:type="spellStart"/>
+      <w:r>
+        <w:t>MudPaper</w:t>
+      </w:r>
+      <w:proofErr w:type="spellEnd"/>
+      <w:r>
+        <w:t>&gt;</w:t>
+      </w:r>
+    </w:p>
+    <w:p>
+      <w:pPr>
+        <w:spacing w:after="0"/>
+      </w:pPr>
+      <w:r>
+        <w:t xml:space="preserve">            &lt;</w:t>
+      </w:r>
+      <w:proofErr w:type="spellStart"/>
+      <w:r>
+        <w:t>MudSpacer</w:t>
+      </w:r>
+      <w:proofErr w:type="spellEnd"/>
+      <w:r>
+        <w:t xml:space="preserve"> /&gt;</w:t>
+      </w:r>
+    </w:p>
+    <w:p>
+      <w:pPr>
+        <w:spacing w:after="0"/>
+      </w:pPr>
+      <w:r>
+        <w:t xml:space="preserve">            &lt;</w:t>
+      </w:r>
+      <w:proofErr w:type="spellStart"/>
+      <w:r>
+        <w:t>MudPaper</w:t>
+      </w:r>
+      <w:proofErr w:type="spellEnd"/>
+      <w:r>
+        <w:t xml:space="preserve"> Class="d-flex justify-content-end m-0 p-0" Elevation="0"&gt;</w:t>
+      </w:r>
+    </w:p>
+    <w:p>
+      <w:pPr>
+        <w:spacing w:after="0"/>
+      </w:pPr>
+      <w:r>
+        <w:t xml:space="preserve">                    @* &lt;</w:t>
+      </w:r>
+      <w:proofErr w:type="spellStart"/>
+      <w:r>
+        <w:t>MudSwitch</w:t>
+      </w:r>
+      <w:proofErr w:type="spellEnd"/>
+      <w:r>
+        <w:t xml:space="preserve"> @bind-Value="_enableFilter" </w:t>
+      </w:r>
+      <w:proofErr w:type="spellStart"/>
+      <w:r>
+        <w:t>ThumbIcon</w:t>
+      </w:r>
+      <w:proofErr w:type="spellEnd"/>
+      <w:r>
+        <w:t>="</w:t>
+      </w:r>
+      <w:proofErr w:type="gramStart"/>
+      <w:r>
+        <w:t>@(</w:t>
+      </w:r>
+      <w:proofErr w:type="gramEnd"/>
+      <w:r>
+        <w:t>_</w:t>
+      </w:r>
+      <w:proofErr w:type="spellStart"/>
+      <w:r>
+        <w:t>enableFilter</w:t>
+      </w:r>
+      <w:proofErr w:type="spellEnd"/>
+      <w:r>
+        <w:t>==</w:t>
+      </w:r>
+      <w:proofErr w:type="gramStart"/>
+      <w:r>
+        <w:t>true ?</w:t>
+      </w:r>
+      <w:proofErr w:type="gramEnd"/>
+      <w:r>
+        <w:t xml:space="preserve"> </w:t>
+      </w:r>
+      <w:proofErr w:type="spellStart"/>
+      <w:proofErr w:type="gramStart"/>
+      <w:r>
+        <w:t>Icons.Material.Filled.Done</w:t>
+      </w:r>
+      <w:proofErr w:type="spellEnd"/>
+      <w:proofErr w:type="gramEnd"/>
+      <w:r>
+        <w:t xml:space="preserve"> : </w:t>
+      </w:r>
+      <w:proofErr w:type="spellStart"/>
+      <w:proofErr w:type="gramStart"/>
+      <w:r>
+        <w:t>Icons.Material.Filled.Close</w:t>
+      </w:r>
+      <w:proofErr w:type="spellEnd"/>
+      <w:proofErr w:type="gramEnd"/>
+      <w:r>
+        <w:t xml:space="preserve">)" </w:t>
+      </w:r>
+      <w:proofErr w:type="spellStart"/>
+      <w:r>
+        <w:t>ThumbIconColor</w:t>
+      </w:r>
+      <w:proofErr w:type="spellEnd"/>
+      <w:r>
+        <w:t>="</w:t>
+      </w:r>
+      <w:proofErr w:type="gramStart"/>
+      <w:r>
+        <w:t>@(</w:t>
+      </w:r>
+      <w:proofErr w:type="gramEnd"/>
+      <w:r>
+        <w:t>_</w:t>
+      </w:r>
+      <w:proofErr w:type="spellStart"/>
+      <w:r>
+        <w:t>enableFilter</w:t>
+      </w:r>
+      <w:proofErr w:type="spellEnd"/>
+      <w:r>
+        <w:t>==</w:t>
+      </w:r>
+      <w:proofErr w:type="gramStart"/>
+      <w:r>
+        <w:t>true ?</w:t>
+      </w:r>
+      <w:proofErr w:type="gramEnd"/>
+      <w:r>
+        <w:t xml:space="preserve"> </w:t>
+      </w:r>
+      <w:proofErr w:type="spellStart"/>
+      <w:proofErr w:type="gramStart"/>
+      <w:r>
+        <w:t>Color.Success</w:t>
+      </w:r>
+      <w:proofErr w:type="spellEnd"/>
+      <w:r>
+        <w:t xml:space="preserve"> :</w:t>
+      </w:r>
+      <w:proofErr w:type="gramEnd"/>
+      <w:r>
+        <w:t xml:space="preserve"> </w:t>
+      </w:r>
+      <w:proofErr w:type="spellStart"/>
+      <w:r>
+        <w:t>Color.Error</w:t>
+      </w:r>
+      <w:proofErr w:type="spellEnd"/>
+      <w:r>
+        <w:t>)"&gt;Custom Filter&lt;/</w:t>
+      </w:r>
+      <w:proofErr w:type="spellStart"/>
+      <w:r>
+        <w:t>MudSwitch</w:t>
+      </w:r>
+      <w:proofErr w:type="spellEnd"/>
+      <w:r>
+        <w:t>&gt; *@</w:t>
+      </w:r>
+    </w:p>
+    <w:p>
+      <w:pPr>
+        <w:spacing w:after="0"/>
+      </w:pPr>
+      <w:r>
+        <w:t xml:space="preserve">                    &lt;</w:t>
+      </w:r>
+      <w:proofErr w:type="spellStart"/>
+      <w:r>
+        <w:t>MudSwitch</w:t>
+      </w:r>
+      <w:proofErr w:type="spellEnd"/>
+      <w:r>
+        <w:t xml:space="preserve"> @bind-Value="_enableFilter" Color="</w:t>
+      </w:r>
+      <w:proofErr w:type="spellStart"/>
+      <w:r>
+        <w:t>Color.Success</w:t>
+      </w:r>
+      <w:proofErr w:type="spellEnd"/>
+      <w:r>
+        <w:t xml:space="preserve">" </w:t>
+      </w:r>
+      <w:proofErr w:type="spellStart"/>
+      <w:r>
+        <w:t>UncheckedColor</w:t>
+      </w:r>
+      <w:proofErr w:type="spellEnd"/>
+      <w:r>
+        <w:t>="</w:t>
+      </w:r>
+      <w:proofErr w:type="spellStart"/>
+      <w:r>
+        <w:t>Color.Default</w:t>
+      </w:r>
+      <w:proofErr w:type="spellEnd"/>
+      <w:r>
+        <w:t>"</w:t>
+      </w:r>
+    </w:p>
+    <w:p>
+      <w:pPr>
+        <w:spacing w:after="0"/>
+      </w:pPr>
+      <w:r>
+        <w:t xml:space="preserve">                    Label="Enable Custom Filter" </w:t>
+      </w:r>
+      <w:proofErr w:type="spellStart"/>
+      <w:r>
+        <w:t>LabelPlacement</w:t>
+      </w:r>
+      <w:proofErr w:type="spellEnd"/>
+      <w:r>
+        <w:t>="</w:t>
+      </w:r>
+      <w:proofErr w:type="spellStart"/>
+      <w:r>
+        <w:t>Placement.Start</w:t>
+      </w:r>
+      <w:proofErr w:type="spellEnd"/>
+      <w:r>
+        <w:t>" /&gt;</w:t>
+      </w:r>
+    </w:p>
+    <w:p>
+      <w:pPr>
+        <w:spacing w:after="0"/>
+      </w:pPr>
+      <w:r>
+        <w:t xml:space="preserve">                    &lt;</w:t>
+      </w:r>
+      <w:proofErr w:type="spellStart"/>
+      <w:r>
+        <w:t>MudPaper</w:t>
+      </w:r>
+      <w:proofErr w:type="spellEnd"/>
+      <w:r>
+        <w:t xml:space="preserve"> Class="ms-3" Elevation="0"&gt;</w:t>
+      </w:r>
+    </w:p>
+    <w:p>
+      <w:pPr>
+        <w:spacing w:after="0"/>
+      </w:pPr>
+      <w:r>
+        <w:t xml:space="preserve">                        &lt;</w:t>
+      </w:r>
+      <w:proofErr w:type="spellStart"/>
+      <w:r>
+        <w:t>MudFab</w:t>
+      </w:r>
+      <w:proofErr w:type="spellEnd"/>
+      <w:r>
+        <w:t xml:space="preserve"> Color="</w:t>
+      </w:r>
+      <w:proofErr w:type="spellStart"/>
+      <w:r>
+        <w:t>Color.Info</w:t>
+      </w:r>
+      <w:proofErr w:type="spellEnd"/>
+      <w:r>
+        <w:t xml:space="preserve">" </w:t>
+      </w:r>
+      <w:proofErr w:type="spellStart"/>
+      <w:r>
+        <w:t>StartIcon</w:t>
+      </w:r>
+      <w:proofErr w:type="spellEnd"/>
+      <w:r>
+        <w:t>="@</w:t>
+      </w:r>
+      <w:proofErr w:type="spellStart"/>
+      <w:proofErr w:type="gramStart"/>
+      <w:r>
+        <w:t>Icons.Material.Filled.Add</w:t>
+      </w:r>
+      <w:proofErr w:type="spellEnd"/>
+      <w:proofErr w:type="gramEnd"/>
+      <w:r>
+        <w:t>" Size="</w:t>
+      </w:r>
+      <w:proofErr w:type="spellStart"/>
+      <w:r>
+        <w:t>Size.Small</w:t>
+      </w:r>
+      <w:proofErr w:type="spellEnd"/>
+      <w:r>
+        <w:t xml:space="preserve">" title="Add new recruitment budget" </w:t>
+      </w:r>
+      <w:proofErr w:type="spellStart"/>
+      <w:r>
+        <w:t>OnClick</w:t>
+      </w:r>
+      <w:proofErr w:type="spellEnd"/>
+      <w:r>
+        <w:t>="</w:t>
+      </w:r>
+      <w:proofErr w:type="spellStart"/>
+      <w:r>
+        <w:t>AddBudgetAsync</w:t>
+      </w:r>
+      <w:proofErr w:type="spellEnd"/>
+      <w:r>
+        <w:t>" /&gt;</w:t>
+      </w:r>
+    </w:p>
+    <w:p>
+      <w:pPr>
+        <w:spacing w:after="0"/>
+      </w:pPr>
+      <w:r>
+        <w:t xml:space="preserve">                    &lt;/</w:t>
+      </w:r>
+      <w:proofErr w:type="spellStart"/>
+      <w:r>
+        <w:t>MudPaper</w:t>
+      </w:r>
+      <w:proofErr w:type="spellEnd"/>
+      <w:r>
+        <w:t xml:space="preserve">&gt;                             </w:t>
+      </w:r>
+    </w:p>
+    <w:p>
+      <w:pPr>
+        <w:spacing w:after="0"/>
+      </w:pPr>
+      <w:r>
+        <w:t xml:space="preserve">            &lt;/</w:t>
+      </w:r>
+      <w:proofErr w:type="spellStart"/>
+      <w:r>
+        <w:t>MudPaper</w:t>
+      </w:r>
+      <w:proofErr w:type="spellEnd"/>
+      <w:r>
+        <w:t>&gt;</w:t>
+      </w:r>
+    </w:p>
+    <w:p>
+      <w:pPr>
+        <w:spacing w:after="0"/>
+      </w:pPr>
+      <w:r>
+        <w:t xml:space="preserve">        &lt;/</w:t>
+      </w:r>
+      <w:proofErr w:type="spellStart"/>
+      <w:r>
+        <w:t>ToolBarContent</w:t>
+      </w:r>
+      <w:proofErr w:type="spellEnd"/>
+      <w:r>
+        <w:t>&gt;</w:t>
+      </w:r>
+    </w:p>
+    <w:p>
+      <w:pPr>
+        <w:spacing w:after="0"/>
+      </w:pPr>
+      <w:r>
+        <w:t xml:space="preserve">        &lt;Columns&gt;</w:t>
+      </w:r>
+    </w:p>
+    <w:p>
+      <w:pPr>
+        <w:spacing w:after="0"/>
+      </w:pPr>
+      <w:r>
+        <w:t xml:space="preserve">            &lt;</w:t>
+      </w:r>
+      <w:proofErr w:type="spellStart"/>
+      <w:r>
+        <w:t>PropertyColumn</w:t>
+      </w:r>
+      <w:proofErr w:type="spellEnd"/>
+      <w:r>
+        <w:t xml:space="preserve"> Property="x =&gt; </w:t>
+      </w:r>
+      <w:proofErr w:type="spellStart"/>
+      <w:proofErr w:type="gramStart"/>
+      <w:r>
+        <w:t>x.BudgetId</w:t>
+      </w:r>
+      <w:proofErr w:type="spellEnd"/>
+      <w:proofErr w:type="gramEnd"/>
+      <w:r>
+        <w:t>" Hidden Editable="false"&gt;</w:t>
+      </w:r>
+    </w:p>
+    <w:p>
+      <w:pPr>
+        <w:spacing w:after="0"/>
+      </w:pPr>
+      <w:r>
+        <w:t xml:space="preserve">                    &lt;</w:t>
+      </w:r>
+      <w:proofErr w:type="spellStart"/>
+      <w:r>
+        <w:t>EditTemplate</w:t>
+      </w:r>
+      <w:proofErr w:type="spellEnd"/>
+      <w:r>
+        <w:t xml:space="preserve"> Context="row"&gt;</w:t>
+      </w:r>
+    </w:p>
+    <w:p>
+      <w:pPr>
+        <w:spacing w:after="0"/>
+      </w:pPr>
+      <w:r>
+        <w:t xml:space="preserve">                        @* Empty to prevent rendering *@</w:t>
+      </w:r>
+    </w:p>
+    <w:p>
+      <w:pPr>
+        <w:spacing w:after="0"/>
+      </w:pPr>
+      <w:r>
+        <w:t xml:space="preserve">                    &lt;/</w:t>
+      </w:r>
+      <w:proofErr w:type="spellStart"/>
+      <w:r>
+        <w:t>EditTemplate</w:t>
+      </w:r>
+      <w:proofErr w:type="spellEnd"/>
+      <w:r>
+        <w:t>&gt;</w:t>
+      </w:r>
+    </w:p>
+    <w:p>
+      <w:pPr>
+        <w:spacing w:after="0"/>
+      </w:pPr>
+      <w:r>
+        <w:t xml:space="preserve">            &lt;/</w:t>
+      </w:r>
+      <w:proofErr w:type="spellStart"/>
+      <w:r>
+        <w:t>PropertyColumn</w:t>
+      </w:r>
+      <w:proofErr w:type="spellEnd"/>
+      <w:r>
+        <w:t>&gt;</w:t>
+      </w:r>
+    </w:p>
+    <w:p>
+      <w:pPr>
+        <w:spacing w:after="0"/>
+      </w:pPr>
+      <w:r>
+        <w:t xml:space="preserve">            &lt;</w:t>
+      </w:r>
+      <w:proofErr w:type="spellStart"/>
+      <w:r>
+        <w:t>PropertyColumn</w:t>
+      </w:r>
+      <w:proofErr w:type="spellEnd"/>
+      <w:r>
+        <w:t xml:space="preserve"> Property="x =&gt; </w:t>
+      </w:r>
+      <w:proofErr w:type="spellStart"/>
+      <w:proofErr w:type="gramStart"/>
+      <w:r>
+        <w:t>x.DepartmentCode</w:t>
+      </w:r>
+      <w:proofErr w:type="spellEnd"/>
+      <w:proofErr w:type="gramEnd"/>
+      <w:r>
+        <w:t>" Hidden Required="false"&gt;</w:t>
+      </w:r>
+    </w:p>
+    <w:p>
+      <w:pPr>
+        <w:spacing w:after="0"/>
+      </w:pPr>
+      <w:r>
+        <w:t xml:space="preserve">                &lt;</w:t>
+      </w:r>
+      <w:proofErr w:type="spellStart"/>
+      <w:r>
+        <w:t>EditTemplate</w:t>
+      </w:r>
+      <w:proofErr w:type="spellEnd"/>
+      <w:r>
+        <w:t xml:space="preserve"> Context="row"&gt;</w:t>
+      </w:r>
+    </w:p>
+    <w:p>
+      <w:pPr>
+        <w:spacing w:after="0"/>
+      </w:pPr>
+      <w:r>
+        <w:t xml:space="preserve">                    @* Empty to prevent rendering *@</w:t>
+      </w:r>
+    </w:p>
+    <w:p>
+      <w:pPr>
+        <w:spacing w:after="0"/>
+      </w:pPr>
+      <w:r>
+        <w:t xml:space="preserve">                &lt;/</w:t>
+      </w:r>
+      <w:proofErr w:type="spellStart"/>
+      <w:r>
+        <w:t>EditTemplate</w:t>
+      </w:r>
+      <w:proofErr w:type="spellEnd"/>
+      <w:r>
+        <w:t>&gt;</w:t>
+      </w:r>
+    </w:p>
+    <w:p>
+      <w:pPr>
+        <w:spacing w:after="0"/>
+      </w:pPr>
+      <w:r>
+        <w:t xml:space="preserve">                &lt;/</w:t>
+      </w:r>
+      <w:proofErr w:type="spellStart"/>
+      <w:r>
+        <w:t>PropertyColumn</w:t>
+      </w:r>
+      <w:proofErr w:type="spellEnd"/>
+      <w:r>
+        <w:t>&gt;</w:t>
+      </w:r>
+    </w:p>
+    <w:p>
+      <w:pPr>
+        <w:spacing w:after="0"/>
+      </w:pPr>
+      <w:r>
+        <w:t xml:space="preserve">                &lt;</w:t>
+      </w:r>
+      <w:proofErr w:type="spellStart"/>
+      <w:r>
+        <w:t>PropertyColumn</w:t>
+      </w:r>
+      <w:proofErr w:type="spellEnd"/>
+      <w:r>
+        <w:t xml:space="preserve"> Property="x =&gt; </w:t>
+      </w:r>
+      <w:proofErr w:type="spellStart"/>
+      <w:proofErr w:type="gramStart"/>
+      <w:r>
+        <w:t>x.DepartmentName</w:t>
+      </w:r>
+      <w:proofErr w:type="spellEnd"/>
+      <w:proofErr w:type="gramEnd"/>
+      <w:r>
+        <w:t>" Title="Department" Class="col-dept-name" Editable="false" StickyLeft="true"&gt;</w:t>
+      </w:r>
+    </w:p>
+    <w:p>
+      <w:pPr>
+        <w:spacing w:after="0"/>
+      </w:pPr>
+      <w:r>
+        <w:t xml:space="preserve">                    &lt;</w:t>
+      </w:r>
+      <w:proofErr w:type="spellStart"/>
+      <w:r>
+        <w:t>CellTemplate</w:t>
+      </w:r>
+      <w:proofErr w:type="spellEnd"/>
+      <w:r>
+        <w:t xml:space="preserve"> Context="row"&gt;</w:t>
+      </w:r>
+    </w:p>
+    <w:p>
+      <w:pPr>
+        <w:spacing w:after="0"/>
+      </w:pPr>
+      <w:r>
+        <w:t xml:space="preserve">                        &lt;</w:t>
+      </w:r>
+      <w:proofErr w:type="spellStart"/>
+      <w:r>
+        <w:t>MudChip</w:t>
+      </w:r>
+      <w:proofErr w:type="spellEnd"/>
+      <w:r>
+        <w:t xml:space="preserve"> T="string" Size=</w:t>
+      </w:r>
+      <w:proofErr w:type="spellStart"/>
+      <w:r>
+        <w:t>Size.Small</w:t>
+      </w:r>
+      <w:proofErr w:type="spellEnd"/>
+      <w:r>
+        <w:t xml:space="preserve"> Color="</w:t>
+      </w:r>
+      <w:proofErr w:type="spellStart"/>
+      <w:r>
+        <w:t>Color.Info</w:t>
+      </w:r>
+      <w:proofErr w:type="spellEnd"/>
+      <w:r>
+        <w:t>" Label="true" Class="</w:t>
+      </w:r>
+      <w:proofErr w:type="spellStart"/>
+      <w:r>
+        <w:t>fw</w:t>
+      </w:r>
+      <w:proofErr w:type="spellEnd"/>
+      <w:r>
+        <w:t>-bold" Style="font-size: 14px;"&gt;</w:t>
+      </w:r>
+    </w:p>
+    <w:p>
+      <w:pPr>
+        <w:spacing w:after="0"/>
+      </w:pPr>
+      <w:r>
+        <w:t xml:space="preserve">                            @</w:t>
+      </w:r>
+      <w:proofErr w:type="gramStart"/>
+      <w:r>
+        <w:t>row.Item.DepartmentName</w:t>
+      </w:r>
+      <w:proofErr w:type="gramEnd"/>
+    </w:p>
+    <w:p>
+      <w:pPr>
+        <w:spacing w:after="0"/>
+      </w:pPr>
+      <w:r>
+        <w:lastRenderedPageBreak/>
+        <w:t xml:space="preserve">                    &lt;/</w:t>
+      </w:r>
+      <w:proofErr w:type="spellStart"/>
+      <w:r>
+        <w:t>MudChip</w:t>
+      </w:r>
+      <w:proofErr w:type="spellEnd"/>
+      <w:r>
+        <w:t>&gt;</w:t>
+      </w:r>
+    </w:p>
+    <w:p>
+      <w:pPr>
+        <w:spacing w:after="0"/>
+      </w:pPr>
+      <w:r>
+        <w:t xml:space="preserve">                &lt;/</w:t>
+      </w:r>
+      <w:proofErr w:type="spellStart"/>
+      <w:r>
+        <w:t>CellTemplate</w:t>
+      </w:r>
+      <w:proofErr w:type="spellEnd"/>
+      <w:r>
+        <w:t>&gt;</w:t>
+      </w:r>
+    </w:p>
+    <w:p>
+      <w:pPr>
+        <w:spacing w:after="0"/>
+      </w:pPr>
+      <w:r>
+        <w:t xml:space="preserve">                @* &lt;</w:t>
+      </w:r>
+      <w:proofErr w:type="spellStart"/>
+      <w:r>
+        <w:t>EditTemplate</w:t>
+      </w:r>
+      <w:proofErr w:type="spellEnd"/>
+      <w:r>
+        <w:t xml:space="preserve"> Context="row"&gt;</w:t>
+      </w:r>
+    </w:p>
+    <w:p>
+      <w:pPr>
+        <w:spacing w:after="0"/>
+      </w:pPr>
+      <w:r>
+        <w:t xml:space="preserve">                        &lt;</w:t>
+      </w:r>
+      <w:proofErr w:type="spellStart"/>
+      <w:r>
+        <w:t>MudAutocomplete</w:t>
+      </w:r>
+      <w:proofErr w:type="spellEnd"/>
+      <w:r>
+        <w:t xml:space="preserve"> @bind-Value="</w:t>
+      </w:r>
+      <w:proofErr w:type="gramStart"/>
+      <w:r>
+        <w:t>row.Item.DepartmentName</w:t>
+      </w:r>
+      <w:proofErr w:type="gramEnd"/>
+      <w:r>
+        <w:t>"</w:t>
+      </w:r>
+    </w:p>
+    <w:p>
+      <w:pPr>
+        <w:spacing w:after="0"/>
+      </w:pPr>
+      <w:r>
+        <w:t xml:space="preserve">                            </w:t>
+      </w:r>
+      <w:proofErr w:type="spellStart"/>
+      <w:r>
+        <w:t>SearchFunc</w:t>
+      </w:r>
+      <w:proofErr w:type="spellEnd"/>
+      <w:r>
+        <w:t>="</w:t>
+      </w:r>
+      <w:proofErr w:type="spellStart"/>
+      <w:r>
+        <w:t>SearchDepartment</w:t>
+      </w:r>
+      <w:proofErr w:type="spellEnd"/>
+      <w:r>
+        <w:t>!"</w:t>
+      </w:r>
+    </w:p>
+    <w:p>
+      <w:pPr>
+        <w:spacing w:after="0"/>
+      </w:pPr>
+      <w:r>
+        <w:t xml:space="preserve">                            Variant="</w:t>
+      </w:r>
+      <w:proofErr w:type="spellStart"/>
+      <w:r>
+        <w:t>Variant.Text</w:t>
+      </w:r>
+      <w:proofErr w:type="spellEnd"/>
+      <w:r>
+        <w:t>"</w:t>
+      </w:r>
+    </w:p>
+    <w:p>
+      <w:pPr>
+        <w:spacing w:after="0"/>
+      </w:pPr>
+      <w:r>
+        <w:t xml:space="preserve">                            Label="Department"</w:t>
+      </w:r>
+    </w:p>
+    <w:p>
+      <w:pPr>
+        <w:spacing w:after="0"/>
+      </w:pPr>
+      <w:r>
+        <w:t xml:space="preserve">                            Margin="</w:t>
+      </w:r>
+      <w:proofErr w:type="spellStart"/>
+      <w:r>
+        <w:t>Margin.Normal</w:t>
+      </w:r>
+      <w:proofErr w:type="spellEnd"/>
+      <w:r>
+        <w:t>"</w:t>
+      </w:r>
+    </w:p>
+    <w:p>
+      <w:pPr>
+        <w:spacing w:after="0"/>
+      </w:pPr>
+      <w:r>
+        <w:t xml:space="preserve">                            Dense="true"</w:t>
+      </w:r>
+    </w:p>
+    <w:p>
+      <w:pPr>
+        <w:spacing w:after="0"/>
+      </w:pPr>
+      <w:r>
+        <w:t xml:space="preserve">                            Placeholder="Please Select"</w:t>
+      </w:r>
+    </w:p>
+    <w:p>
+      <w:pPr>
+        <w:spacing w:after="0"/>
+      </w:pPr>
+      <w:r>
+        <w:t xml:space="preserve">                            </w:t>
+      </w:r>
+      <w:proofErr w:type="spellStart"/>
+      <w:r>
+        <w:t>HelperText</w:t>
+      </w:r>
+      <w:proofErr w:type="spellEnd"/>
+      <w:r>
+        <w:t>="Type a key to search for department"</w:t>
+      </w:r>
+    </w:p>
+    <w:p>
+      <w:pPr>
+        <w:spacing w:after="0"/>
+      </w:pPr>
+      <w:r>
+        <w:t xml:space="preserve">                            </w:t>
+      </w:r>
+      <w:proofErr w:type="spellStart"/>
+      <w:r>
+        <w:t>HelperTextOnFocus</w:t>
+      </w:r>
+      <w:proofErr w:type="spellEnd"/>
+      <w:r>
+        <w:t>="true"</w:t>
+      </w:r>
+    </w:p>
+    <w:p>
+      <w:pPr>
+        <w:spacing w:after="0"/>
+      </w:pPr>
+      <w:r>
+        <w:t xml:space="preserve">                            Clearable="true" Typo="Typo.subtitle2"</w:t>
+      </w:r>
+    </w:p>
+    <w:p>
+      <w:pPr>
+        <w:spacing w:after="0"/>
+      </w:pPr>
+      <w:r>
+        <w:t xml:space="preserve">                            </w:t>
+      </w:r>
+      <w:proofErr w:type="spellStart"/>
+      <w:r>
+        <w:t>MaxItems</w:t>
+      </w:r>
+      <w:proofErr w:type="spellEnd"/>
+      <w:r>
+        <w:t>="</w:t>
+      </w:r>
+      <w:proofErr w:type="gramStart"/>
+      <w:r>
+        <w:t>@(</w:t>
+      </w:r>
+      <w:proofErr w:type="gramEnd"/>
+      <w:r>
+        <w:t>_</w:t>
+      </w:r>
+      <w:proofErr w:type="spellStart"/>
+      <w:proofErr w:type="gramStart"/>
+      <w:r>
+        <w:t>departmentList</w:t>
+      </w:r>
+      <w:proofErr w:type="spellEnd"/>
+      <w:r>
+        <w:t xml:space="preserve"> !</w:t>
+      </w:r>
+      <w:proofErr w:type="gramEnd"/>
+      <w:r>
+        <w:t xml:space="preserve">= </w:t>
+      </w:r>
+      <w:proofErr w:type="gramStart"/>
+      <w:r>
+        <w:t>null ?</w:t>
+      </w:r>
+      <w:proofErr w:type="gramEnd"/>
+      <w:r>
+        <w:t xml:space="preserve"> _</w:t>
+      </w:r>
+      <w:proofErr w:type="spellStart"/>
+      <w:proofErr w:type="gramStart"/>
+      <w:r>
+        <w:t>departmentList.Count</w:t>
+      </w:r>
+      <w:proofErr w:type="spellEnd"/>
+      <w:r>
+        <w:t xml:space="preserve"> :</w:t>
+      </w:r>
+      <w:proofErr w:type="gramEnd"/>
+      <w:r>
+        <w:t xml:space="preserve"> 10)"</w:t>
+      </w:r>
+    </w:p>
+    <w:p>
+      <w:pPr>
+        <w:spacing w:after="0"/>
+      </w:pPr>
+      <w:r>
+        <w:t xml:space="preserve">                            Modal="true" /&gt;</w:t>
+      </w:r>
+    </w:p>
+    <w:p>
+      <w:pPr>
+        <w:spacing w:after="0"/>
+      </w:pPr>
+      <w:r>
+        <w:t xml:space="preserve">                &lt;/</w:t>
+      </w:r>
+      <w:proofErr w:type="spellStart"/>
+      <w:r>
+        <w:t>EditTemplate</w:t>
+      </w:r>
+      <w:proofErr w:type="spellEnd"/>
+      <w:r>
+        <w:t>&gt; *@</w:t>
+      </w:r>
+    </w:p>
+    <w:p>
+      <w:pPr>
+        <w:spacing w:after="0"/>
+      </w:pPr>
+      <w:r>
+        <w:t xml:space="preserve">            &lt;/</w:t>
+      </w:r>
+      <w:proofErr w:type="spellStart"/>
+      <w:r>
+        <w:t>PropertyColumn</w:t>
+      </w:r>
+      <w:proofErr w:type="spellEnd"/>
+      <w:r>
+        <w:t>&gt;</w:t>
+      </w:r>
+    </w:p>
+    <w:p>
+      <w:pPr>
+        <w:spacing w:after="0"/>
+      </w:pPr>
+      <w:r>
+        <w:t xml:space="preserve">                &lt;</w:t>
+      </w:r>
+      <w:proofErr w:type="spellStart"/>
+      <w:r>
+        <w:t>PropertyColumn</w:t>
+      </w:r>
+      <w:proofErr w:type="spellEnd"/>
+      <w:r>
+        <w:t xml:space="preserve"> Property="x =&gt; </w:t>
+      </w:r>
+      <w:proofErr w:type="spellStart"/>
+      <w:proofErr w:type="gramStart"/>
+      <w:r>
+        <w:t>x.BudgetDescription</w:t>
+      </w:r>
+      <w:proofErr w:type="spellEnd"/>
+      <w:proofErr w:type="gramEnd"/>
+      <w:r>
+        <w:t>" Title="Budget Description" Class="col-description"&gt;</w:t>
+      </w:r>
+    </w:p>
+    <w:p>
+      <w:pPr>
+        <w:spacing w:after="0"/>
+      </w:pPr>
+      <w:r>
+        <w:t xml:space="preserve">                    &lt;</w:t>
+      </w:r>
+      <w:proofErr w:type="spellStart"/>
+      <w:r>
+        <w:t>EditTemplate</w:t>
+      </w:r>
+      <w:proofErr w:type="spellEnd"/>
+      <w:r>
+        <w:t xml:space="preserve"> Context="row"&gt;</w:t>
+      </w:r>
+    </w:p>
+    <w:p>
+      <w:pPr>
+        <w:spacing w:after="0"/>
+      </w:pPr>
+      <w:r>
+        <w:t xml:space="preserve">                    &lt;</w:t>
+      </w:r>
+      <w:proofErr w:type="spellStart"/>
+      <w:r>
+        <w:t>MudTextField</w:t>
+      </w:r>
+      <w:proofErr w:type="spellEnd"/>
+      <w:r>
+        <w:t xml:space="preserve"> @bind-Value="</w:t>
+      </w:r>
+      <w:proofErr w:type="gramStart"/>
+      <w:r>
+        <w:t>row.Item.BudgetDescription</w:t>
+      </w:r>
+      <w:proofErr w:type="gramEnd"/>
+      <w:r>
+        <w:t>" For="</w:t>
+      </w:r>
+      <w:proofErr w:type="gramStart"/>
+      <w:r>
+        <w:t>@(</w:t>
+      </w:r>
+      <w:proofErr w:type="gramEnd"/>
+      <w:r>
+        <w:t xml:space="preserve">() =&gt; </w:t>
+      </w:r>
+      <w:proofErr w:type="spellStart"/>
+      <w:proofErr w:type="gramStart"/>
+      <w:r>
+        <w:t>row.Item.BudgetDescription</w:t>
+      </w:r>
+      <w:proofErr w:type="spellEnd"/>
+      <w:proofErr w:type="gramEnd"/>
+      <w:r>
+        <w:t>)"</w:t>
+      </w:r>
+    </w:p>
+    <w:p>
+      <w:pPr>
+        <w:spacing w:after="0"/>
+      </w:pPr>
+      <w:r>
+        <w:t xml:space="preserve">                        Label="Budget Description" </w:t>
+      </w:r>
+    </w:p>
+    <w:p>
+      <w:pPr>
+        <w:spacing w:after="0"/>
+      </w:pPr>
+      <w:r>
+        <w:t xml:space="preserve">                        </w:t>
+      </w:r>
+      <w:proofErr w:type="spellStart"/>
+      <w:r>
+        <w:t>HelperText</w:t>
+      </w:r>
+      <w:proofErr w:type="spellEnd"/>
+      <w:r>
+        <w:t>="Maximum input is 200 chars."</w:t>
+      </w:r>
+    </w:p>
+    <w:p>
+      <w:pPr>
+        <w:spacing w:after="0"/>
+      </w:pPr>
+      <w:r>
+        <w:t xml:space="preserve">                        Variant="</w:t>
+      </w:r>
+      <w:proofErr w:type="spellStart"/>
+      <w:r>
+        <w:t>Variant.Outlined</w:t>
+      </w:r>
+      <w:proofErr w:type="spellEnd"/>
+      <w:r>
+        <w:t xml:space="preserve">" </w:t>
+      </w:r>
+      <w:proofErr w:type="spellStart"/>
+      <w:r>
+        <w:t>HelperTextOnFocus</w:t>
+      </w:r>
+      <w:proofErr w:type="spellEnd"/>
+      <w:r>
+        <w:t xml:space="preserve">="true" Counter="200" </w:t>
+      </w:r>
+      <w:proofErr w:type="spellStart"/>
+      <w:r>
+        <w:t>MaxLength</w:t>
+      </w:r>
+      <w:proofErr w:type="spellEnd"/>
+      <w:r>
+        <w:t>="200"</w:t>
+      </w:r>
+    </w:p>
+    <w:p>
+      <w:pPr>
+        <w:spacing w:after="0"/>
+      </w:pPr>
+      <w:r>
+        <w:t xml:space="preserve">                        Immediate="true" Margin="</w:t>
+      </w:r>
+      <w:proofErr w:type="spellStart"/>
+      <w:r>
+        <w:t>Margin.Dense</w:t>
+      </w:r>
+      <w:proofErr w:type="spellEnd"/>
+      <w:r>
+        <w:t>" Typo="Typo.subtitle2" /&gt;</w:t>
+      </w:r>
+    </w:p>
+    <w:p>
+      <w:pPr>
+        <w:spacing w:after="0"/>
+      </w:pPr>
+      <w:r>
+        <w:t xml:space="preserve">                    &lt;/</w:t>
+      </w:r>
+      <w:proofErr w:type="spellStart"/>
+      <w:r>
+        <w:t>EditTemplate</w:t>
+      </w:r>
+      <w:proofErr w:type="spellEnd"/>
+      <w:r>
+        <w:t>&gt;</w:t>
+      </w:r>
+    </w:p>
+    <w:p>
+      <w:pPr>
+        <w:spacing w:after="0"/>
+      </w:pPr>
+      <w:r>
+        <w:t xml:space="preserve">                &lt;/</w:t>
+      </w:r>
+      <w:proofErr w:type="spellStart"/>
+      <w:r>
+        <w:t>PropertyColumn</w:t>
+      </w:r>
+      <w:proofErr w:type="spellEnd"/>
+      <w:r>
+        <w:t>&gt;</w:t>
+      </w:r>
+    </w:p>
+    <w:p>
+      <w:pPr>
+        <w:spacing w:after="0"/>
+      </w:pPr>
+      <w:r>
+        <w:t xml:space="preserve">            &lt;</w:t>
+      </w:r>
+      <w:proofErr w:type="spellStart"/>
+      <w:r>
+        <w:t>PropertyColumn</w:t>
+      </w:r>
+      <w:proofErr w:type="spellEnd"/>
+      <w:r>
+        <w:t xml:space="preserve"> Property="x =&gt; </w:t>
+      </w:r>
+      <w:proofErr w:type="spellStart"/>
+      <w:proofErr w:type="gramStart"/>
+      <w:r>
+        <w:t>x.BudgetHeadCount</w:t>
+      </w:r>
+      <w:proofErr w:type="spellEnd"/>
+      <w:proofErr w:type="gramEnd"/>
+      <w:r>
+        <w:t>" Title="Head Count Budget" Class="col-head-count"&gt;</w:t>
+      </w:r>
+    </w:p>
+    <w:p>
+      <w:pPr>
+        <w:spacing w:after="0"/>
+      </w:pPr>
+      <w:r>
+        <w:t xml:space="preserve">                    &lt;</w:t>
+      </w:r>
+      <w:proofErr w:type="spellStart"/>
+      <w:r>
+        <w:t>EditTemplate</w:t>
+      </w:r>
+      <w:proofErr w:type="spellEnd"/>
+      <w:r>
+        <w:t xml:space="preserve"> Context="row"&gt;</w:t>
+      </w:r>
+    </w:p>
+    <w:p>
+      <w:pPr>
+        <w:spacing w:after="0"/>
+      </w:pPr>
+      <w:r>
+        <w:t xml:space="preserve">                        &lt;</w:t>
+      </w:r>
+      <w:proofErr w:type="spellStart"/>
+      <w:r>
+        <w:t>MudNumericField</w:t>
+      </w:r>
+      <w:proofErr w:type="spellEnd"/>
+      <w:r>
+        <w:t xml:space="preserve"> @bind-Value="</w:t>
+      </w:r>
+      <w:proofErr w:type="gramStart"/>
+      <w:r>
+        <w:t>row.Item.BudgetHeadCount</w:t>
+      </w:r>
+      <w:proofErr w:type="gramEnd"/>
+      <w:r>
+        <w:t>" Label="Head Count Budget"</w:t>
+      </w:r>
+    </w:p>
+    <w:p>
+      <w:pPr>
+        <w:spacing w:after="0"/>
+      </w:pPr>
+      <w:r>
+        <w:t xml:space="preserve">                        For="</w:t>
+      </w:r>
+      <w:proofErr w:type="gramStart"/>
+      <w:r>
+        <w:t>@(</w:t>
+      </w:r>
+      <w:proofErr w:type="gramEnd"/>
+      <w:r>
+        <w:t xml:space="preserve">() =&gt; </w:t>
+      </w:r>
+      <w:proofErr w:type="spellStart"/>
+      <w:proofErr w:type="gramStart"/>
+      <w:r>
+        <w:t>row.Item.BudgetHeadCount</w:t>
+      </w:r>
+      <w:proofErr w:type="spellEnd"/>
+      <w:proofErr w:type="gramEnd"/>
+      <w:r>
+        <w:t>)"</w:t>
+      </w:r>
+    </w:p>
+    <w:p>
+      <w:pPr>
+        <w:spacing w:after="0"/>
+      </w:pPr>
+      <w:r>
+        <w:t xml:space="preserve">                        Variant="</w:t>
+      </w:r>
+      <w:proofErr w:type="spellStart"/>
+      <w:r>
+        <w:t>Variant.Outlined</w:t>
+      </w:r>
+      <w:proofErr w:type="spellEnd"/>
+      <w:r>
+        <w:t>"</w:t>
+      </w:r>
+    </w:p>
+    <w:p>
+      <w:pPr>
+        <w:spacing w:after="0"/>
+      </w:pPr>
+      <w:r>
+        <w:t xml:space="preserve">                        </w:t>
+      </w:r>
+      <w:proofErr w:type="spellStart"/>
+      <w:r>
+        <w:t>HelperText</w:t>
+      </w:r>
+      <w:proofErr w:type="spellEnd"/>
+      <w:r>
+        <w:t xml:space="preserve">="Maximum input is 9999" </w:t>
+      </w:r>
+      <w:proofErr w:type="spellStart"/>
+      <w:r>
+        <w:t>HelperTextOnFocus</w:t>
+      </w:r>
+      <w:proofErr w:type="spellEnd"/>
+      <w:r>
+        <w:t xml:space="preserve">="true" </w:t>
+      </w:r>
+      <w:proofErr w:type="spellStart"/>
+      <w:r>
+        <w:t>MaxLength</w:t>
+      </w:r>
+      <w:proofErr w:type="spellEnd"/>
+      <w:r>
+        <w:t>="4" Min="0" Max="9999"</w:t>
+      </w:r>
+    </w:p>
+    <w:p>
+      <w:pPr>
+        <w:spacing w:after="0"/>
+      </w:pPr>
+      <w:r>
+        <w:t xml:space="preserve">                        Required </w:t>
+      </w:r>
+      <w:proofErr w:type="spellStart"/>
+      <w:r>
+        <w:t>RequiredError</w:t>
+      </w:r>
+      <w:proofErr w:type="spellEnd"/>
+      <w:r>
+        <w:t>="Head Count Budget is required"</w:t>
+      </w:r>
+    </w:p>
+    <w:p>
+      <w:pPr>
+        <w:spacing w:after="0"/>
+      </w:pPr>
+      <w:r>
+        <w:lastRenderedPageBreak/>
+        <w:t xml:space="preserve">                        Immediate="true" Margin="</w:t>
+      </w:r>
+      <w:proofErr w:type="spellStart"/>
+      <w:r>
+        <w:t>Margin.Dense</w:t>
+      </w:r>
+      <w:proofErr w:type="spellEnd"/>
+      <w:r>
+        <w:t>" Typo="Typo.subtitle2" /&gt;</w:t>
+      </w:r>
+    </w:p>
+    <w:p>
+      <w:pPr>
+        <w:spacing w:after="0"/>
+      </w:pPr>
+      <w:r>
+        <w:t xml:space="preserve">                &lt;/</w:t>
+      </w:r>
+      <w:proofErr w:type="spellStart"/>
+      <w:r>
+        <w:t>EditTemplate</w:t>
+      </w:r>
+      <w:proofErr w:type="spellEnd"/>
+      <w:r>
+        <w:t>&gt;</w:t>
+      </w:r>
+    </w:p>
+    <w:p>
+      <w:pPr>
+        <w:spacing w:after="0"/>
+      </w:pPr>
+      <w:r>
+        <w:t xml:space="preserve">            &lt;/</w:t>
+      </w:r>
+      <w:proofErr w:type="spellStart"/>
+      <w:r>
+        <w:t>PropertyColumn</w:t>
+      </w:r>
+      <w:proofErr w:type="spellEnd"/>
+      <w:r>
+        <w:t>&gt;</w:t>
+      </w:r>
+    </w:p>
+    <w:p>
+      <w:pPr>
+        <w:spacing w:after="0"/>
+      </w:pPr>
+      <w:r>
+        <w:t xml:space="preserve">            &lt;</w:t>
+      </w:r>
+      <w:proofErr w:type="spellStart"/>
+      <w:r>
+        <w:t>PropertyColumn</w:t>
+      </w:r>
+      <w:proofErr w:type="spellEnd"/>
+      <w:r>
+        <w:t xml:space="preserve"> Property="x =&gt; </w:t>
+      </w:r>
+      <w:proofErr w:type="spellStart"/>
+      <w:proofErr w:type="gramStart"/>
+      <w:r>
+        <w:t>x.ActiveCount</w:t>
+      </w:r>
+      <w:proofErr w:type="spellEnd"/>
+      <w:proofErr w:type="gramEnd"/>
+      <w:r>
+        <w:t>" Title="Active Employees" Class="col-active-count"&gt;</w:t>
+      </w:r>
+    </w:p>
+    <w:p>
+      <w:pPr>
+        <w:spacing w:after="0"/>
+      </w:pPr>
+      <w:r>
+        <w:t xml:space="preserve">                    &lt;</w:t>
+      </w:r>
+      <w:proofErr w:type="spellStart"/>
+      <w:r>
+        <w:t>EditTemplate</w:t>
+      </w:r>
+      <w:proofErr w:type="spellEnd"/>
+      <w:r>
+        <w:t xml:space="preserve"> Context="row"&gt;</w:t>
+      </w:r>
+    </w:p>
+    <w:p>
+      <w:pPr>
+        <w:spacing w:after="0"/>
+      </w:pPr>
+      <w:r>
+        <w:t xml:space="preserve">                        &lt;</w:t>
+      </w:r>
+      <w:proofErr w:type="spellStart"/>
+      <w:r>
+        <w:t>MudNumericField</w:t>
+      </w:r>
+      <w:proofErr w:type="spellEnd"/>
+      <w:r>
+        <w:t xml:space="preserve"> @bind-Value="</w:t>
+      </w:r>
+      <w:proofErr w:type="gramStart"/>
+      <w:r>
+        <w:t>row.Item.ActiveCount</w:t>
+      </w:r>
+      <w:proofErr w:type="gramEnd"/>
+      <w:r>
+        <w:t>" Label="Active Employees"</w:t>
+      </w:r>
+    </w:p>
+    <w:p>
+      <w:pPr>
+        <w:spacing w:after="0"/>
+      </w:pPr>
+      <w:r>
+        <w:t xml:space="preserve">                                        For="</w:t>
+      </w:r>
+      <w:proofErr w:type="gramStart"/>
+      <w:r>
+        <w:t>@(</w:t>
+      </w:r>
+      <w:proofErr w:type="gramEnd"/>
+      <w:r>
+        <w:t xml:space="preserve">() =&gt; </w:t>
+      </w:r>
+      <w:proofErr w:type="spellStart"/>
+      <w:proofErr w:type="gramStart"/>
+      <w:r>
+        <w:t>row.Item.ActiveCount</w:t>
+      </w:r>
+      <w:proofErr w:type="spellEnd"/>
+      <w:proofErr w:type="gramEnd"/>
+      <w:r>
+        <w:t>)"</w:t>
+      </w:r>
+    </w:p>
+    <w:p>
+      <w:pPr>
+        <w:spacing w:after="0"/>
+      </w:pPr>
+      <w:r>
+        <w:t xml:space="preserve">                        Variant="</w:t>
+      </w:r>
+      <w:proofErr w:type="spellStart"/>
+      <w:r>
+        <w:t>Variant.Outlined</w:t>
+      </w:r>
+      <w:proofErr w:type="spellEnd"/>
+      <w:r>
+        <w:t>"</w:t>
+      </w:r>
+    </w:p>
+    <w:p>
+      <w:pPr>
+        <w:spacing w:after="0"/>
+      </w:pPr>
+      <w:r>
+        <w:t xml:space="preserve">                        </w:t>
+      </w:r>
+      <w:proofErr w:type="spellStart"/>
+      <w:r>
+        <w:t>HelperText</w:t>
+      </w:r>
+      <w:proofErr w:type="spellEnd"/>
+      <w:r>
+        <w:t xml:space="preserve">="Maximum input is 9999" </w:t>
+      </w:r>
+      <w:proofErr w:type="spellStart"/>
+      <w:r>
+        <w:t>HelperTextOnFocus</w:t>
+      </w:r>
+      <w:proofErr w:type="spellEnd"/>
+      <w:r>
+        <w:t xml:space="preserve">="true" </w:t>
+      </w:r>
+      <w:proofErr w:type="spellStart"/>
+      <w:r>
+        <w:t>MaxLength</w:t>
+      </w:r>
+      <w:proofErr w:type="spellEnd"/>
+      <w:r>
+        <w:t>="4" Min="0" Max="9999"</w:t>
+      </w:r>
+    </w:p>
+    <w:p>
+      <w:pPr>
+        <w:spacing w:after="0"/>
+      </w:pPr>
+      <w:r>
+        <w:t xml:space="preserve">                        Immediate="true" Margin="</w:t>
+      </w:r>
+      <w:proofErr w:type="spellStart"/>
+      <w:r>
+        <w:t>Margin.Dense</w:t>
+      </w:r>
+      <w:proofErr w:type="spellEnd"/>
+      <w:r>
+        <w:t>" Typo="Typo.subtitle2" /&gt;</w:t>
+      </w:r>
+    </w:p>
+    <w:p>
+      <w:pPr>
+        <w:spacing w:after="0"/>
+      </w:pPr>
+      <w:r>
+        <w:t xml:space="preserve">                &lt;/</w:t>
+      </w:r>
+      <w:proofErr w:type="spellStart"/>
+      <w:r>
+        <w:t>EditTemplate</w:t>
+      </w:r>
+      <w:proofErr w:type="spellEnd"/>
+      <w:r>
+        <w:t>&gt;</w:t>
+      </w:r>
+    </w:p>
+    <w:p>
+      <w:pPr>
+        <w:spacing w:after="0"/>
+      </w:pPr>
+      <w:r>
+        <w:t xml:space="preserve">            &lt;/</w:t>
+      </w:r>
+      <w:proofErr w:type="spellStart"/>
+      <w:r>
+        <w:t>PropertyColumn</w:t>
+      </w:r>
+      <w:proofErr w:type="spellEnd"/>
+      <w:r>
+        <w:t>&gt;</w:t>
+      </w:r>
+    </w:p>
+    <w:p>
+      <w:pPr>
+        <w:spacing w:after="0"/>
+      </w:pPr>
+      <w:r>
+        <w:t xml:space="preserve">                &lt;</w:t>
+      </w:r>
+      <w:proofErr w:type="spellStart"/>
+      <w:r>
+        <w:t>PropertyColumn</w:t>
+      </w:r>
+      <w:proofErr w:type="spellEnd"/>
+      <w:r>
+        <w:t xml:space="preserve"> Property="x =&gt; </w:t>
+      </w:r>
+      <w:proofErr w:type="spellStart"/>
+      <w:proofErr w:type="gramStart"/>
+      <w:r>
+        <w:t>x.RequisitionCount</w:t>
+      </w:r>
+      <w:proofErr w:type="spellEnd"/>
+      <w:proofErr w:type="gramEnd"/>
+      <w:r>
+        <w:t>" Title="Active Requisitions" Class="col-requisition-count" Editable="false"&gt;</w:t>
+      </w:r>
+    </w:p>
+    <w:p>
+      <w:pPr>
+        <w:spacing w:after="0"/>
+      </w:pPr>
+      <w:r>
+        <w:t xml:space="preserve">                    &lt;</w:t>
+      </w:r>
+      <w:proofErr w:type="spellStart"/>
+      <w:r>
+        <w:t>CellTemplate</w:t>
+      </w:r>
+      <w:proofErr w:type="spellEnd"/>
+      <w:r>
+        <w:t xml:space="preserve"> Context="row"&gt;</w:t>
+      </w:r>
+    </w:p>
+    <w:p>
+      <w:pPr>
+        <w:spacing w:after="0"/>
+      </w:pPr>
+      <w:r>
+        <w:t xml:space="preserve">                        &lt;</w:t>
+      </w:r>
+      <w:proofErr w:type="spellStart"/>
+      <w:r>
+        <w:t>MudBadge</w:t>
+      </w:r>
+      <w:proofErr w:type="spellEnd"/>
+      <w:r>
+        <w:t xml:space="preserve"> Content="</w:t>
+      </w:r>
+      <w:proofErr w:type="spellStart"/>
+      <w:proofErr w:type="gramStart"/>
+      <w:r>
+        <w:t>row.Item.RequisitionCount</w:t>
+      </w:r>
+      <w:proofErr w:type="spellEnd"/>
+      <w:proofErr w:type="gramEnd"/>
+      <w:r>
+        <w:t>" Color="</w:t>
+      </w:r>
+      <w:proofErr w:type="gramStart"/>
+      <w:r>
+        <w:t>@(</w:t>
+      </w:r>
+      <w:proofErr w:type="spellStart"/>
+      <w:r>
+        <w:t>row.Item.RequisitionCount</w:t>
+      </w:r>
+      <w:proofErr w:type="spellEnd"/>
+      <w:proofErr w:type="gramEnd"/>
+      <w:r>
+        <w:t xml:space="preserve"> &gt; </w:t>
+      </w:r>
+      <w:proofErr w:type="gramStart"/>
+      <w:r>
+        <w:t>0 ?</w:t>
+      </w:r>
+      <w:proofErr w:type="gramEnd"/>
+      <w:r>
+        <w:t xml:space="preserve"> </w:t>
+      </w:r>
+      <w:proofErr w:type="spellStart"/>
+      <w:proofErr w:type="gramStart"/>
+      <w:r>
+        <w:t>Color.Success</w:t>
+      </w:r>
+      <w:proofErr w:type="spellEnd"/>
+      <w:r>
+        <w:t xml:space="preserve"> :</w:t>
+      </w:r>
+      <w:proofErr w:type="gramEnd"/>
+      <w:r>
+        <w:t xml:space="preserve"> </w:t>
+      </w:r>
+      <w:proofErr w:type="spellStart"/>
+      <w:r>
+        <w:t>Color.Default</w:t>
+      </w:r>
+      <w:proofErr w:type="spellEnd"/>
+      <w:r>
+        <w:t>)" title="@($"{</w:t>
+      </w:r>
+      <w:proofErr w:type="spellStart"/>
+      <w:proofErr w:type="gramStart"/>
+      <w:r>
+        <w:t>row.Item.RequisitionCount</w:t>
+      </w:r>
+      <w:proofErr w:type="spellEnd"/>
+      <w:proofErr w:type="gramEnd"/>
+      <w:r>
+        <w:t>} active requisitions")"</w:t>
+      </w:r>
+    </w:p>
+    <w:p>
+      <w:pPr>
+        <w:spacing w:after="0"/>
+      </w:pPr>
+      <w:r>
+        <w:t xml:space="preserve">                        Overlap="true" Bordered="false" Class="mx-6 my-4"&gt;</w:t>
+      </w:r>
+    </w:p>
+    <w:p>
+      <w:pPr>
+        <w:spacing w:after="0"/>
+      </w:pPr>
+      <w:r>
+        <w:t xml:space="preserve">                            &lt;</w:t>
+      </w:r>
+      <w:proofErr w:type="spellStart"/>
+      <w:r>
+        <w:t>MudIconButton</w:t>
+      </w:r>
+      <w:proofErr w:type="spellEnd"/>
+      <w:r>
+        <w:t xml:space="preserve"> Icon="@</w:t>
+      </w:r>
+      <w:proofErr w:type="spellStart"/>
+      <w:proofErr w:type="gramStart"/>
+      <w:r>
+        <w:t>Icons.Material.Filled.People</w:t>
+      </w:r>
+      <w:proofErr w:type="spellEnd"/>
+      <w:proofErr w:type="gramEnd"/>
+      <w:r>
+        <w:t>" Color="</w:t>
+      </w:r>
+      <w:proofErr w:type="gramStart"/>
+      <w:r>
+        <w:t>@(</w:t>
+      </w:r>
+      <w:proofErr w:type="spellStart"/>
+      <w:r>
+        <w:t>row.Item.RequisitionCount</w:t>
+      </w:r>
+      <w:proofErr w:type="spellEnd"/>
+      <w:proofErr w:type="gramEnd"/>
+      <w:r>
+        <w:t xml:space="preserve"> &gt; </w:t>
+      </w:r>
+      <w:proofErr w:type="gramStart"/>
+      <w:r>
+        <w:t>0 ?</w:t>
+      </w:r>
+      <w:proofErr w:type="gramEnd"/>
+      <w:r>
+        <w:t xml:space="preserve"> </w:t>
+      </w:r>
+      <w:proofErr w:type="spellStart"/>
+      <w:proofErr w:type="gramStart"/>
+      <w:r>
+        <w:t>Color.Info</w:t>
+      </w:r>
+      <w:proofErr w:type="spellEnd"/>
+      <w:r>
+        <w:t xml:space="preserve"> :</w:t>
+      </w:r>
+      <w:proofErr w:type="gramEnd"/>
+      <w:r>
+        <w:t xml:space="preserve"> </w:t>
+      </w:r>
+      <w:proofErr w:type="spellStart"/>
+      <w:r>
+        <w:t>Color.Default</w:t>
+      </w:r>
+      <w:proofErr w:type="spellEnd"/>
+      <w:r>
+        <w:t xml:space="preserve">)" </w:t>
+      </w:r>
+      <w:proofErr w:type="spellStart"/>
+      <w:r>
+        <w:t>OnClick</w:t>
+      </w:r>
+      <w:proofErr w:type="spellEnd"/>
+      <w:r>
+        <w:t>="</w:t>
+      </w:r>
+      <w:proofErr w:type="gramStart"/>
+      <w:r>
+        <w:t>@(</w:t>
+      </w:r>
+      <w:proofErr w:type="gramEnd"/>
+      <w:r>
+        <w:t xml:space="preserve">() =&gt; </w:t>
+      </w:r>
+      <w:proofErr w:type="spellStart"/>
+      <w:r>
+        <w:t>OpenActiveRecruitments</w:t>
+      </w:r>
+      <w:proofErr w:type="spellEnd"/>
+      <w:r>
+        <w:t>(</w:t>
+      </w:r>
+      <w:proofErr w:type="spellStart"/>
+      <w:proofErr w:type="gramStart"/>
+      <w:r>
+        <w:t>row.Item</w:t>
+      </w:r>
+      <w:proofErr w:type="spellEnd"/>
+      <w:proofErr w:type="gramEnd"/>
+      <w:r>
+        <w:t>))" /&gt;</w:t>
+      </w:r>
+    </w:p>
+    <w:p>
+      <w:pPr>
+        <w:spacing w:after="0"/>
+      </w:pPr>
+      <w:r>
+        <w:t xml:space="preserve">                    &lt;/</w:t>
+      </w:r>
+      <w:proofErr w:type="spellStart"/>
+      <w:r>
+        <w:t>MudBadge</w:t>
+      </w:r>
+      <w:proofErr w:type="spellEnd"/>
+      <w:r>
+        <w:t>&gt;</w:t>
+      </w:r>
+    </w:p>
+    <w:p>
+      <w:pPr>
+        <w:spacing w:after="0"/>
+      </w:pPr>
+      <w:r>
+        <w:t xml:space="preserve">                &lt;/</w:t>
+      </w:r>
+      <w:proofErr w:type="spellStart"/>
+      <w:r>
+        <w:t>CellTemplate</w:t>
+      </w:r>
+      <w:proofErr w:type="spellEnd"/>
+      <w:r>
+        <w:t>&gt;</w:t>
+      </w:r>
+    </w:p>
+    <w:p>
+      <w:pPr>
+        <w:spacing w:after="0"/>
+      </w:pPr>
+      <w:r>
+        <w:t xml:space="preserve">            &lt;/</w:t>
+      </w:r>
+      <w:proofErr w:type="spellStart"/>
+      <w:r>
+        <w:t>PropertyColumn</w:t>
+      </w:r>
+      <w:proofErr w:type="spellEnd"/>
+      <w:r>
+        <w:t>&gt;</w:t>
+      </w:r>
+    </w:p>
+    <w:p>
+      <w:pPr>
+        <w:spacing w:after="0"/>
+      </w:pPr>
+      <w:r>
+        <w:t xml:space="preserve">            &lt;</w:t>
+      </w:r>
+      <w:proofErr w:type="spellStart"/>
+      <w:r>
+        <w:t>PropertyColumn</w:t>
+      </w:r>
+      <w:proofErr w:type="spellEnd"/>
+      <w:r>
+        <w:t xml:space="preserve"> Property="x =&gt; </w:t>
+      </w:r>
+      <w:proofErr w:type="spellStart"/>
+      <w:proofErr w:type="gramStart"/>
+      <w:r>
+        <w:t>x.ExitCount</w:t>
+      </w:r>
+      <w:proofErr w:type="spellEnd"/>
+      <w:proofErr w:type="gramEnd"/>
+      <w:r>
+        <w:t>" Title="Exit Employees" Class="col-exit-count"&gt;</w:t>
+      </w:r>
+    </w:p>
+    <w:p>
+      <w:pPr>
+        <w:spacing w:after="0"/>
+      </w:pPr>
+      <w:r>
+        <w:t xml:space="preserve">                    &lt;</w:t>
+      </w:r>
+      <w:proofErr w:type="spellStart"/>
+      <w:r>
+        <w:t>EditTemplate</w:t>
+      </w:r>
+      <w:proofErr w:type="spellEnd"/>
+      <w:r>
+        <w:t xml:space="preserve"> Context="row"&gt;</w:t>
+      </w:r>
+    </w:p>
+    <w:p>
+      <w:pPr>
+        <w:spacing w:after="0"/>
+      </w:pPr>
+      <w:r>
+        <w:t xml:space="preserve">                        &lt;</w:t>
+      </w:r>
+      <w:proofErr w:type="spellStart"/>
+      <w:r>
+        <w:t>MudNumericField</w:t>
+      </w:r>
+      <w:proofErr w:type="spellEnd"/>
+      <w:r>
+        <w:t xml:space="preserve"> @bind-Value="</w:t>
+      </w:r>
+      <w:proofErr w:type="gramStart"/>
+      <w:r>
+        <w:t>row.Item.ExitCount</w:t>
+      </w:r>
+      <w:proofErr w:type="gramEnd"/>
+      <w:r>
+        <w:t>" Label="Exit Employees"</w:t>
+      </w:r>
+    </w:p>
+    <w:p>
+      <w:pPr>
+        <w:spacing w:after="0"/>
+      </w:pPr>
+      <w:r>
+        <w:t xml:space="preserve">                        For="</w:t>
+      </w:r>
+      <w:proofErr w:type="gramStart"/>
+      <w:r>
+        <w:t>@(</w:t>
+      </w:r>
+      <w:proofErr w:type="gramEnd"/>
+      <w:r>
+        <w:t xml:space="preserve">() =&gt; </w:t>
+      </w:r>
+      <w:proofErr w:type="spellStart"/>
+      <w:proofErr w:type="gramStart"/>
+      <w:r>
+        <w:t>row.Item.ExitCount</w:t>
+      </w:r>
+      <w:proofErr w:type="spellEnd"/>
+      <w:proofErr w:type="gramEnd"/>
+      <w:r>
+        <w:t>)"</w:t>
+      </w:r>
+    </w:p>
+    <w:p>
+      <w:pPr>
+        <w:spacing w:after="0"/>
+      </w:pPr>
+      <w:r>
+        <w:t xml:space="preserve">                        Variant="</w:t>
+      </w:r>
+      <w:proofErr w:type="spellStart"/>
+      <w:r>
+        <w:t>Variant.Outlined</w:t>
+      </w:r>
+      <w:proofErr w:type="spellEnd"/>
+      <w:r>
+        <w:t>"</w:t>
+      </w:r>
+    </w:p>
+    <w:p>
+      <w:pPr>
+        <w:spacing w:after="0"/>
+      </w:pPr>
+      <w:r>
+        <w:t xml:space="preserve">                        </w:t>
+      </w:r>
+      <w:proofErr w:type="spellStart"/>
+      <w:r>
+        <w:t>HelperText</w:t>
+      </w:r>
+      <w:proofErr w:type="spellEnd"/>
+      <w:r>
+        <w:t xml:space="preserve">="Maximum input is 9999" </w:t>
+      </w:r>
+      <w:proofErr w:type="spellStart"/>
+      <w:r>
+        <w:t>HelperTextOnFocus</w:t>
+      </w:r>
+      <w:proofErr w:type="spellEnd"/>
+      <w:r>
+        <w:t xml:space="preserve">="true" </w:t>
+      </w:r>
+      <w:proofErr w:type="spellStart"/>
+      <w:r>
+        <w:t>MaxLength</w:t>
+      </w:r>
+      <w:proofErr w:type="spellEnd"/>
+      <w:r>
+        <w:t>="4" Min="0" Max="9999"</w:t>
+      </w:r>
+    </w:p>
+    <w:p>
+      <w:pPr>
+        <w:spacing w:after="0"/>
+      </w:pPr>
+      <w:r>
+        <w:t xml:space="preserve">                        Immediate="true" Margin="</w:t>
+      </w:r>
+      <w:proofErr w:type="spellStart"/>
+      <w:r>
+        <w:t>Margin.Dense</w:t>
+      </w:r>
+      <w:proofErr w:type="spellEnd"/>
+      <w:r>
+        <w:t>" Typo="Typo.subtitle2" /&gt;</w:t>
+      </w:r>
+    </w:p>
+    <w:p>
+      <w:pPr>
+        <w:spacing w:after="0"/>
+      </w:pPr>
+      <w:r>
+        <w:t xml:space="preserve">                    &lt;/</w:t>
+      </w:r>
+      <w:proofErr w:type="spellStart"/>
+      <w:r>
+        <w:t>EditTemplate</w:t>
+      </w:r>
+      <w:proofErr w:type="spellEnd"/>
+      <w:r>
+        <w:t>&gt;</w:t>
+      </w:r>
+    </w:p>
+    <w:p>
+      <w:pPr>
+        <w:spacing w:after="0"/>
+      </w:pPr>
+      <w:r>
+        <w:t xml:space="preserve">                &lt;/</w:t>
+      </w:r>
+      <w:proofErr w:type="spellStart"/>
+      <w:r>
+        <w:t>PropertyColumn</w:t>
+      </w:r>
+      <w:proofErr w:type="spellEnd"/>
+      <w:r>
+        <w:t>&gt;</w:t>
+      </w:r>
+    </w:p>
+    <w:p>
+      <w:pPr>
+        <w:spacing w:after="0"/>
+      </w:pPr>
+      <w:r>
+        <w:t xml:space="preserve">                &lt;</w:t>
+      </w:r>
+      <w:proofErr w:type="spellStart"/>
+      <w:r>
+        <w:t>PropertyColumn</w:t>
+      </w:r>
+      <w:proofErr w:type="spellEnd"/>
+      <w:r>
+        <w:t xml:space="preserve"> Property="x =&gt; </w:t>
+      </w:r>
+      <w:proofErr w:type="spellStart"/>
+      <w:proofErr w:type="gramStart"/>
+      <w:r>
+        <w:t>x.NetGapCount</w:t>
+      </w:r>
+      <w:proofErr w:type="spellEnd"/>
+      <w:proofErr w:type="gramEnd"/>
+      <w:r>
+        <w:t>" Title="Net Gap" Class="col-gap-count" Editable="false"&gt;</w:t>
+      </w:r>
+    </w:p>
+    <w:p>
+      <w:pPr>
+        <w:spacing w:after="0"/>
+      </w:pPr>
+      <w:r>
+        <w:lastRenderedPageBreak/>
+        <w:t xml:space="preserve">                    @* &lt;</w:t>
+      </w:r>
+      <w:proofErr w:type="spellStart"/>
+      <w:r>
+        <w:t>EditTemplate</w:t>
+      </w:r>
+      <w:proofErr w:type="spellEnd"/>
+      <w:r>
+        <w:t xml:space="preserve"> Context="row"&gt;</w:t>
+      </w:r>
+    </w:p>
+    <w:p>
+      <w:pPr>
+        <w:spacing w:after="0"/>
+      </w:pPr>
+      <w:r>
+        <w:t xml:space="preserve">                        &lt;</w:t>
+      </w:r>
+      <w:proofErr w:type="spellStart"/>
+      <w:r>
+        <w:t>MudNumericField</w:t>
+      </w:r>
+      <w:proofErr w:type="spellEnd"/>
+      <w:r>
+        <w:t xml:space="preserve"> @bind-Value="</w:t>
+      </w:r>
+      <w:proofErr w:type="gramStart"/>
+      <w:r>
+        <w:t>row.Item.NetGapCount</w:t>
+      </w:r>
+      <w:proofErr w:type="gramEnd"/>
+      <w:r>
+        <w:t>" Label="Net Gap" Variant="</w:t>
+      </w:r>
+      <w:proofErr w:type="spellStart"/>
+      <w:r>
+        <w:t>Variant.Outlined</w:t>
+      </w:r>
+      <w:proofErr w:type="spellEnd"/>
+      <w:r>
+        <w:t>"</w:t>
+      </w:r>
+    </w:p>
+    <w:p>
+      <w:pPr>
+        <w:spacing w:after="0"/>
+      </w:pPr>
+      <w:r>
+        <w:t xml:space="preserve">                                        </w:t>
+      </w:r>
+      <w:proofErr w:type="spellStart"/>
+      <w:r>
+        <w:t>HelperText</w:t>
+      </w:r>
+      <w:proofErr w:type="spellEnd"/>
+      <w:r>
+        <w:t xml:space="preserve">="Maximum input is 9999" </w:t>
+      </w:r>
+      <w:proofErr w:type="spellStart"/>
+      <w:r>
+        <w:t>HelperTextOnFocus</w:t>
+      </w:r>
+      <w:proofErr w:type="spellEnd"/>
+      <w:r>
+        <w:t xml:space="preserve">="true" </w:t>
+      </w:r>
+      <w:proofErr w:type="spellStart"/>
+      <w:r>
+        <w:t>MaxLength</w:t>
+      </w:r>
+      <w:proofErr w:type="spellEnd"/>
+      <w:r>
+        <w:t>="4" Min="0" Max="9999"</w:t>
+      </w:r>
+    </w:p>
+    <w:p>
+      <w:pPr>
+        <w:spacing w:after="0"/>
+      </w:pPr>
+      <w:r>
+        <w:t xml:space="preserve">                                        Immediate="true" Margin="</w:t>
+      </w:r>
+      <w:proofErr w:type="spellStart"/>
+      <w:r>
+        <w:t>Margin.Dense</w:t>
+      </w:r>
+      <w:proofErr w:type="spellEnd"/>
+      <w:r>
+        <w:t>" Typo="Typo.subtitle2" /&gt;</w:t>
+      </w:r>
+    </w:p>
+    <w:p>
+      <w:pPr>
+        <w:spacing w:after="0"/>
+      </w:pPr>
+      <w:r>
+        <w:t xml:space="preserve">                    &lt;/</w:t>
+      </w:r>
+      <w:proofErr w:type="spellStart"/>
+      <w:r>
+        <w:t>EditTemplate</w:t>
+      </w:r>
+      <w:proofErr w:type="spellEnd"/>
+      <w:r>
+        <w:t>&gt; *@</w:t>
+      </w:r>
+    </w:p>
+    <w:p>
+      <w:pPr>
+        <w:spacing w:after="0"/>
+      </w:pPr>
+      <w:r>
+        <w:t xml:space="preserve">                &lt;/</w:t>
+      </w:r>
+      <w:proofErr w:type="spellStart"/>
+      <w:r>
+        <w:t>PropertyColumn</w:t>
+      </w:r>
+      <w:proofErr w:type="spellEnd"/>
+      <w:r>
+        <w:t>&gt;</w:t>
+      </w:r>
+    </w:p>
+    <w:p>
+      <w:pPr>
+        <w:spacing w:after="0"/>
+      </w:pPr>
+      <w:r>
+        <w:t xml:space="preserve">                &lt;</w:t>
+      </w:r>
+      <w:proofErr w:type="spellStart"/>
+      <w:r>
+        <w:t>PropertyColumn</w:t>
+      </w:r>
+      <w:proofErr w:type="spellEnd"/>
+      <w:r>
+        <w:t xml:space="preserve"> Property="x =&gt; </w:t>
+      </w:r>
+      <w:proofErr w:type="spellStart"/>
+      <w:proofErr w:type="gramStart"/>
+      <w:r>
+        <w:t>x.NewIndentCount</w:t>
+      </w:r>
+      <w:proofErr w:type="spellEnd"/>
+      <w:proofErr w:type="gramEnd"/>
+      <w:r>
+        <w:t>" Title="New Indent" Class="col-indent-count"&gt;</w:t>
+      </w:r>
+    </w:p>
+    <w:p>
+      <w:pPr>
+        <w:spacing w:after="0"/>
+      </w:pPr>
+      <w:r>
+        <w:t xml:space="preserve">                    &lt;</w:t>
+      </w:r>
+      <w:proofErr w:type="spellStart"/>
+      <w:r>
+        <w:t>EditTemplate</w:t>
+      </w:r>
+      <w:proofErr w:type="spellEnd"/>
+      <w:r>
+        <w:t xml:space="preserve"> Context="row"&gt;</w:t>
+      </w:r>
+    </w:p>
+    <w:p>
+      <w:pPr>
+        <w:spacing w:after="0"/>
+      </w:pPr>
+      <w:r>
+        <w:t xml:space="preserve">                        &lt;</w:t>
+      </w:r>
+      <w:proofErr w:type="spellStart"/>
+      <w:r>
+        <w:t>MudNumericField</w:t>
+      </w:r>
+      <w:proofErr w:type="spellEnd"/>
+      <w:r>
+        <w:t xml:space="preserve"> @bind-Value="</w:t>
+      </w:r>
+      <w:proofErr w:type="gramStart"/>
+      <w:r>
+        <w:t>row.Item.NewIndentCount</w:t>
+      </w:r>
+      <w:proofErr w:type="gramEnd"/>
+      <w:r>
+        <w:t>" Label="New Indent"</w:t>
+      </w:r>
+    </w:p>
+    <w:p>
+      <w:pPr>
+        <w:spacing w:after="0"/>
+      </w:pPr>
+      <w:r>
+        <w:t xml:space="preserve">                        For="</w:t>
+      </w:r>
+      <w:proofErr w:type="gramStart"/>
+      <w:r>
+        <w:t>@(</w:t>
+      </w:r>
+      <w:proofErr w:type="gramEnd"/>
+      <w:r>
+        <w:t xml:space="preserve">() =&gt; </w:t>
+      </w:r>
+      <w:proofErr w:type="spellStart"/>
+      <w:proofErr w:type="gramStart"/>
+      <w:r>
+        <w:t>row.Item.NewIndentCount</w:t>
+      </w:r>
+      <w:proofErr w:type="spellEnd"/>
+      <w:proofErr w:type="gramEnd"/>
+      <w:r>
+        <w:t>)"</w:t>
+      </w:r>
+    </w:p>
+    <w:p>
+      <w:pPr>
+        <w:spacing w:after="0"/>
+      </w:pPr>
+      <w:r>
+        <w:t xml:space="preserve">                        Variant="</w:t>
+      </w:r>
+      <w:proofErr w:type="spellStart"/>
+      <w:r>
+        <w:t>Variant.Outlined</w:t>
+      </w:r>
+      <w:proofErr w:type="spellEnd"/>
+      <w:r>
+        <w:t>"</w:t>
+      </w:r>
+    </w:p>
+    <w:p>
+      <w:pPr>
+        <w:spacing w:after="0"/>
+      </w:pPr>
+      <w:r>
+        <w:t xml:space="preserve">                        </w:t>
+      </w:r>
+      <w:proofErr w:type="spellStart"/>
+      <w:r>
+        <w:t>HelperText</w:t>
+      </w:r>
+      <w:proofErr w:type="spellEnd"/>
+      <w:r>
+        <w:t xml:space="preserve">="Maximum input is 9999" </w:t>
+      </w:r>
+      <w:proofErr w:type="spellStart"/>
+      <w:r>
+        <w:t>HelperTextOnFocus</w:t>
+      </w:r>
+      <w:proofErr w:type="spellEnd"/>
+      <w:r>
+        <w:t xml:space="preserve">="true" </w:t>
+      </w:r>
+      <w:proofErr w:type="spellStart"/>
+      <w:r>
+        <w:t>MaxLength</w:t>
+      </w:r>
+      <w:proofErr w:type="spellEnd"/>
+      <w:r>
+        <w:t>="4" Min="0" Max="9999"</w:t>
+      </w:r>
+    </w:p>
+    <w:p>
+      <w:pPr>
+        <w:spacing w:after="0"/>
+      </w:pPr>
+      <w:r>
+        <w:t xml:space="preserve">                        Immediate="true" Margin="</w:t>
+      </w:r>
+      <w:proofErr w:type="spellStart"/>
+      <w:r>
+        <w:t>Margin.Dense</w:t>
+      </w:r>
+      <w:proofErr w:type="spellEnd"/>
+      <w:r>
+        <w:t>" Typo="Typo.subtitle2" /&gt;</w:t>
+      </w:r>
+    </w:p>
+    <w:p>
+      <w:pPr>
+        <w:spacing w:after="0"/>
+      </w:pPr>
+      <w:r>
+        <w:t xml:space="preserve">                    &lt;/</w:t>
+      </w:r>
+      <w:proofErr w:type="spellStart"/>
+      <w:r>
+        <w:t>EditTemplate</w:t>
+      </w:r>
+      <w:proofErr w:type="spellEnd"/>
+      <w:r>
+        <w:t>&gt;</w:t>
+      </w:r>
+    </w:p>
+    <w:p>
+      <w:pPr>
+        <w:spacing w:after="0"/>
+      </w:pPr>
+      <w:r>
+        <w:t xml:space="preserve">                &lt;/</w:t>
+      </w:r>
+      <w:proofErr w:type="spellStart"/>
+      <w:r>
+        <w:t>PropertyColumn</w:t>
+      </w:r>
+      <w:proofErr w:type="spellEnd"/>
+      <w:r>
+        <w:t>&gt;</w:t>
+      </w:r>
+    </w:p>
+    <w:p>
+      <w:pPr>
+        <w:spacing w:after="0"/>
+      </w:pPr>
+      <w:r>
+        <w:t xml:space="preserve">                &lt;</w:t>
+      </w:r>
+      <w:proofErr w:type="spellStart"/>
+      <w:r>
+        <w:t>PropertyColumn</w:t>
+      </w:r>
+      <w:proofErr w:type="spellEnd"/>
+      <w:r>
+        <w:t xml:space="preserve"> Property="x =&gt; </w:t>
+      </w:r>
+      <w:proofErr w:type="spellStart"/>
+      <w:proofErr w:type="gramStart"/>
+      <w:r>
+        <w:t>x.OnHoldDesc</w:t>
+      </w:r>
+      <w:proofErr w:type="spellEnd"/>
+      <w:proofErr w:type="gramEnd"/>
+      <w:r>
+        <w:t>" Title="On-hold?" Class="col-</w:t>
+      </w:r>
+      <w:proofErr w:type="spellStart"/>
+      <w:r>
+        <w:t>onhold</w:t>
+      </w:r>
+      <w:proofErr w:type="spellEnd"/>
+      <w:r>
+        <w:t>" Required="false"&gt;</w:t>
+      </w:r>
+    </w:p>
+    <w:p>
+      <w:pPr>
+        <w:spacing w:after="0"/>
+      </w:pPr>
+      <w:r>
+        <w:t xml:space="preserve">                    &lt;</w:t>
+      </w:r>
+      <w:proofErr w:type="spellStart"/>
+      <w:r>
+        <w:t>CellTemplate</w:t>
+      </w:r>
+      <w:proofErr w:type="spellEnd"/>
+      <w:r>
+        <w:t xml:space="preserve"> Context="row"&gt;</w:t>
+      </w:r>
+    </w:p>
+    <w:p>
+      <w:pPr>
+        <w:spacing w:after="0"/>
+      </w:pPr>
+      <w:r>
+        <w:t xml:space="preserve">                        &lt;</w:t>
+      </w:r>
+      <w:proofErr w:type="spellStart"/>
+      <w:r>
+        <w:t>MudChip</w:t>
+      </w:r>
+      <w:proofErr w:type="spellEnd"/>
+      <w:r>
+        <w:t xml:space="preserve"> T="string" Size=</w:t>
+      </w:r>
+      <w:proofErr w:type="spellStart"/>
+      <w:r>
+        <w:t>Size.Small</w:t>
+      </w:r>
+      <w:proofErr w:type="spellEnd"/>
+      <w:r>
+        <w:t xml:space="preserve"> Variant="</w:t>
+      </w:r>
+      <w:proofErr w:type="spellStart"/>
+      <w:r>
+        <w:t>Variant.Outlined</w:t>
+      </w:r>
+      <w:proofErr w:type="spellEnd"/>
+      <w:r>
+        <w:t>" Color="</w:t>
+      </w:r>
+      <w:proofErr w:type="gramStart"/>
+      <w:r>
+        <w:t>@(</w:t>
+      </w:r>
+      <w:proofErr w:type="spellStart"/>
+      <w:r>
+        <w:t>row.Item.OnHoldDesc</w:t>
+      </w:r>
+      <w:proofErr w:type="spellEnd"/>
+      <w:proofErr w:type="gramEnd"/>
+      <w:r>
+        <w:t xml:space="preserve"> == "Yes</w:t>
+      </w:r>
+      <w:proofErr w:type="gramStart"/>
+      <w:r>
+        <w:t>" ?</w:t>
+      </w:r>
+      <w:proofErr w:type="gramEnd"/>
+      <w:r>
+        <w:t xml:space="preserve"> </w:t>
+      </w:r>
+      <w:proofErr w:type="spellStart"/>
+      <w:proofErr w:type="gramStart"/>
+      <w:r>
+        <w:t>Color.Error</w:t>
+      </w:r>
+      <w:proofErr w:type="spellEnd"/>
+      <w:r>
+        <w:t xml:space="preserve"> :</w:t>
+      </w:r>
+      <w:proofErr w:type="gramEnd"/>
+      <w:r>
+        <w:t xml:space="preserve"> </w:t>
+      </w:r>
+      <w:proofErr w:type="spellStart"/>
+      <w:r>
+        <w:t>Color.Success</w:t>
+      </w:r>
+      <w:proofErr w:type="spellEnd"/>
+      <w:r>
+        <w:t>)"&gt;</w:t>
+      </w:r>
+    </w:p>
+    <w:p>
+      <w:pPr>
+        <w:spacing w:after="0"/>
+      </w:pPr>
+      <w:r>
+        <w:t xml:space="preserve">                            @</w:t>
+      </w:r>
+      <w:proofErr w:type="gramStart"/>
+      <w:r>
+        <w:t>row.Item.OnHoldDesc</w:t>
+      </w:r>
+      <w:proofErr w:type="gramEnd"/>
+    </w:p>
+    <w:p>
+      <w:pPr>
+        <w:spacing w:after="0"/>
+      </w:pPr>
+      <w:r>
+        <w:t xml:space="preserve">                    &lt;/</w:t>
+      </w:r>
+      <w:proofErr w:type="spellStart"/>
+      <w:r>
+        <w:t>MudChip</w:t>
+      </w:r>
+      <w:proofErr w:type="spellEnd"/>
+      <w:r>
+        <w:t>&gt;</w:t>
+      </w:r>
+    </w:p>
+    <w:p>
+      <w:pPr>
+        <w:spacing w:after="0"/>
+      </w:pPr>
+      <w:r>
+        <w:t xml:space="preserve">                &lt;/</w:t>
+      </w:r>
+      <w:proofErr w:type="spellStart"/>
+      <w:r>
+        <w:t>CellTemplate</w:t>
+      </w:r>
+      <w:proofErr w:type="spellEnd"/>
+      <w:r>
+        <w:t>&gt;</w:t>
+      </w:r>
+    </w:p>
+    <w:p>
+      <w:pPr>
+        <w:spacing w:after="0"/>
+      </w:pPr>
+      <w:r>
+        <w:t xml:space="preserve">                &lt;</w:t>
+      </w:r>
+      <w:proofErr w:type="spellStart"/>
+      <w:r>
+        <w:t>EditTemplate</w:t>
+      </w:r>
+      <w:proofErr w:type="spellEnd"/>
+      <w:r>
+        <w:t xml:space="preserve"> Context="row"&gt;</w:t>
+      </w:r>
+    </w:p>
+    <w:p>
+      <w:pPr>
+        <w:spacing w:after="0"/>
+      </w:pPr>
+      <w:r>
+        <w:t xml:space="preserve">                    &lt;</w:t>
+      </w:r>
+      <w:proofErr w:type="spellStart"/>
+      <w:r>
+        <w:t>MudSwitch</w:t>
+      </w:r>
+      <w:proofErr w:type="spellEnd"/>
+      <w:r>
+        <w:t xml:space="preserve"> @bind-Value="</w:t>
+      </w:r>
+      <w:proofErr w:type="gramStart"/>
+      <w:r>
+        <w:t>row.Item.OnHold</w:t>
+      </w:r>
+      <w:proofErr w:type="gramEnd"/>
+      <w:r>
+        <w:t>" Color="</w:t>
+      </w:r>
+      <w:proofErr w:type="spellStart"/>
+      <w:r>
+        <w:t>Color.Error</w:t>
+      </w:r>
+      <w:proofErr w:type="spellEnd"/>
+      <w:r>
+        <w:t xml:space="preserve">" </w:t>
+      </w:r>
+      <w:proofErr w:type="spellStart"/>
+      <w:r>
+        <w:t>UncheckedColor</w:t>
+      </w:r>
+      <w:proofErr w:type="spellEnd"/>
+      <w:r>
+        <w:t>="</w:t>
+      </w:r>
+      <w:proofErr w:type="spellStart"/>
+      <w:r>
+        <w:t>Color.Default</w:t>
+      </w:r>
+      <w:proofErr w:type="spellEnd"/>
+      <w:r>
+        <w:t>" Label="On-hold?" /&gt;</w:t>
+      </w:r>
+    </w:p>
+    <w:p>
+      <w:pPr>
+        <w:spacing w:after="0"/>
+      </w:pPr>
+      <w:r>
+        <w:t xml:space="preserve">                &lt;/</w:t>
+      </w:r>
+      <w:proofErr w:type="spellStart"/>
+      <w:r>
+        <w:t>EditTemplate</w:t>
+      </w:r>
+      <w:proofErr w:type="spellEnd"/>
+      <w:r>
+        <w:t>&gt;</w:t>
+      </w:r>
+    </w:p>
+    <w:p>
+      <w:pPr>
+        <w:spacing w:after="0"/>
+      </w:pPr>
+      <w:r>
+        <w:t xml:space="preserve">            &lt;/</w:t>
+      </w:r>
+      <w:proofErr w:type="spellStart"/>
+      <w:r>
+        <w:t>PropertyColumn</w:t>
+      </w:r>
+      <w:proofErr w:type="spellEnd"/>
+      <w:r>
+        <w:t>&gt;</w:t>
+      </w:r>
+    </w:p>
+    <w:p>
+      <w:pPr>
+        <w:spacing w:after="0"/>
+      </w:pPr>
+      <w:r>
+        <w:t xml:space="preserve">                &lt;</w:t>
+      </w:r>
+      <w:proofErr w:type="spellStart"/>
+      <w:r>
+        <w:t>PropertyColumn</w:t>
+      </w:r>
+      <w:proofErr w:type="spellEnd"/>
+      <w:r>
+        <w:t xml:space="preserve"> Property="x =&gt; </w:t>
+      </w:r>
+      <w:proofErr w:type="spellStart"/>
+      <w:proofErr w:type="gramStart"/>
+      <w:r>
+        <w:t>x.CreatedDate</w:t>
+      </w:r>
+      <w:proofErr w:type="spellEnd"/>
+      <w:proofErr w:type="gramEnd"/>
+      <w:r>
+        <w:t>" Title="Created Date" Class="col-created-date" Editable="false"&gt;</w:t>
+      </w:r>
+    </w:p>
+    <w:p>
+      <w:pPr>
+        <w:spacing w:after="0"/>
+      </w:pPr>
+      <w:r>
+        <w:t xml:space="preserve">                    &lt;</w:t>
+      </w:r>
+      <w:proofErr w:type="spellStart"/>
+      <w:r>
+        <w:t>CellTemplate</w:t>
+      </w:r>
+      <w:proofErr w:type="spellEnd"/>
+      <w:r>
+        <w:t xml:space="preserve"> Context="row"&gt;</w:t>
+      </w:r>
+    </w:p>
+    <w:p>
+      <w:pPr>
+        <w:spacing w:after="0"/>
+      </w:pPr>
+      <w:r>
+        <w:t xml:space="preserve">                        @</w:t>
+      </w:r>
+      <w:proofErr w:type="gramStart"/>
+      <w:r>
+        <w:t>row.Item.CreatedDate?.ToString</w:t>
+      </w:r>
+      <w:proofErr w:type="gramEnd"/>
+      <w:r>
+        <w:t>("dd-MMM-yyyy")</w:t>
+      </w:r>
+    </w:p>
+    <w:p>
+      <w:pPr>
+        <w:spacing w:after="0"/>
+      </w:pPr>
+      <w:r>
+        <w:t xml:space="preserve">                &lt;/</w:t>
+      </w:r>
+      <w:proofErr w:type="spellStart"/>
+      <w:r>
+        <w:t>CellTemplate</w:t>
+      </w:r>
+      <w:proofErr w:type="spellEnd"/>
+      <w:r>
+        <w:t>&gt;</w:t>
+      </w:r>
+    </w:p>
+    <w:p>
+      <w:pPr>
+        <w:spacing w:after="0"/>
+      </w:pPr>
+      <w:r>
+        <w:t xml:space="preserve">            &lt;/</w:t>
+      </w:r>
+      <w:proofErr w:type="spellStart"/>
+      <w:r>
+        <w:t>PropertyColumn</w:t>
+      </w:r>
+      <w:proofErr w:type="spellEnd"/>
+      <w:r>
+        <w:t>&gt;</w:t>
+      </w:r>
+    </w:p>
+    <w:p>
+      <w:pPr>
+        <w:spacing w:after="0"/>
+      </w:pPr>
+      <w:r>
+        <w:lastRenderedPageBreak/>
+        <w:t xml:space="preserve">            &lt;</w:t>
+      </w:r>
+      <w:proofErr w:type="spellStart"/>
+      <w:r>
+        <w:t>PropertyColumn</w:t>
+      </w:r>
+      <w:proofErr w:type="spellEnd"/>
+      <w:r>
+        <w:t xml:space="preserve"> Property="x =&gt; </w:t>
+      </w:r>
+      <w:proofErr w:type="spellStart"/>
+      <w:proofErr w:type="gramStart"/>
+      <w:r>
+        <w:t>x.LastUpdateDate</w:t>
+      </w:r>
+      <w:proofErr w:type="spellEnd"/>
+      <w:proofErr w:type="gramEnd"/>
+      <w:r>
+        <w:t>" Title="Last Updated Date" Class="col-updated-date" Editable="false"&gt;</w:t>
+      </w:r>
+    </w:p>
+    <w:p>
+      <w:pPr>
+        <w:spacing w:after="0"/>
+      </w:pPr>
+      <w:r>
+        <w:t xml:space="preserve">                &lt;</w:t>
+      </w:r>
+      <w:proofErr w:type="spellStart"/>
+      <w:r>
+        <w:t>CellTemplate</w:t>
+      </w:r>
+      <w:proofErr w:type="spellEnd"/>
+      <w:r>
+        <w:t xml:space="preserve"> Context="row"&gt;</w:t>
+      </w:r>
+    </w:p>
+    <w:p>
+      <w:pPr>
+        <w:spacing w:after="0"/>
+      </w:pPr>
+      <w:r>
+        <w:t xml:space="preserve">                    @</w:t>
+      </w:r>
+      <w:proofErr w:type="gramStart"/>
+      <w:r>
+        <w:t>row.Item.LastUpdateDate?.ToString</w:t>
+      </w:r>
+      <w:proofErr w:type="gramEnd"/>
+      <w:r>
+        <w:t>("dd-MMM-yyyy")</w:t>
+      </w:r>
+    </w:p>
+    <w:p>
+      <w:pPr>
+        <w:spacing w:after="0"/>
+      </w:pPr>
+      <w:r>
+        <w:t xml:space="preserve">                &lt;/</w:t>
+      </w:r>
+      <w:proofErr w:type="spellStart"/>
+      <w:r>
+        <w:t>CellTemplate</w:t>
+      </w:r>
+      <w:proofErr w:type="spellEnd"/>
+      <w:r>
+        <w:t>&gt;</w:t>
+      </w:r>
+    </w:p>
+    <w:p>
+      <w:pPr>
+        <w:spacing w:after="0"/>
+      </w:pPr>
+      <w:r>
+        <w:t xml:space="preserve">            &lt;/</w:t>
+      </w:r>
+      <w:proofErr w:type="spellStart"/>
+      <w:r>
+        <w:t>PropertyColumn</w:t>
+      </w:r>
+      <w:proofErr w:type="spellEnd"/>
+      <w:r>
+        <w:t xml:space="preserve">&gt;                        </w:t>
+      </w:r>
+    </w:p>
+    <w:p>
+      <w:pPr>
+        <w:spacing w:after="0"/>
+      </w:pPr>
+      <w:r>
+        <w:t xml:space="preserve">            @* &lt;</w:t>
+      </w:r>
+      <w:proofErr w:type="spellStart"/>
+      <w:r>
+        <w:t>TemplateColumn</w:t>
+      </w:r>
+      <w:proofErr w:type="spellEnd"/>
+      <w:r>
+        <w:t xml:space="preserve"> Hidden="false" </w:t>
+      </w:r>
+      <w:proofErr w:type="spellStart"/>
+      <w:r>
+        <w:t>CellClass</w:t>
+      </w:r>
+      <w:proofErr w:type="spellEnd"/>
+      <w:r>
+        <w:t>="d-flex justify-end"&gt;</w:t>
+      </w:r>
+    </w:p>
+    <w:p>
+      <w:pPr>
+        <w:spacing w:after="0"/>
+      </w:pPr>
+      <w:r>
+        <w:t xml:space="preserve">                &lt;</w:t>
+      </w:r>
+      <w:proofErr w:type="spellStart"/>
+      <w:r>
+        <w:t>CellTemplate</w:t>
+      </w:r>
+      <w:proofErr w:type="spellEnd"/>
+      <w:r>
+        <w:t xml:space="preserve"> Context="row"&gt;</w:t>
+      </w:r>
+    </w:p>
+    <w:p>
+      <w:pPr>
+        <w:spacing w:after="0"/>
+      </w:pPr>
+      <w:r>
+        <w:t xml:space="preserve">                    &lt;</w:t>
+      </w:r>
+      <w:proofErr w:type="spellStart"/>
+      <w:r>
+        <w:t>MudIconButton</w:t>
+      </w:r>
+      <w:proofErr w:type="spellEnd"/>
+      <w:r>
+        <w:t xml:space="preserve"> Color="</w:t>
+      </w:r>
+      <w:proofErr w:type="spellStart"/>
+      <w:r>
+        <w:t>Color.Info</w:t>
+      </w:r>
+      <w:proofErr w:type="spellEnd"/>
+      <w:r>
+        <w:t xml:space="preserve">" title="Edit budget details" </w:t>
+      </w:r>
+    </w:p>
+    <w:p>
+      <w:pPr>
+        <w:spacing w:after="0"/>
+      </w:pPr>
+      <w:r>
+        <w:t xml:space="preserve">                        Icon="@</w:t>
+      </w:r>
+      <w:proofErr w:type="spellStart"/>
+      <w:proofErr w:type="gramStart"/>
+      <w:r>
+        <w:t>Icons.Material.Rounded.Edit</w:t>
+      </w:r>
+      <w:proofErr w:type="spellEnd"/>
+      <w:proofErr w:type="gramEnd"/>
+      <w:r>
+        <w:t>"</w:t>
+      </w:r>
+    </w:p>
+    <w:p>
+      <w:pPr>
+        <w:spacing w:after="0"/>
+      </w:pPr>
+      <w:r>
+        <w:t xml:space="preserve">                        </w:t>
+      </w:r>
+      <w:proofErr w:type="spellStart"/>
+      <w:r>
+        <w:t>OnClick</w:t>
+      </w:r>
+      <w:proofErr w:type="spellEnd"/>
+      <w:r>
+        <w:t>="</w:t>
+      </w:r>
+      <w:proofErr w:type="gramStart"/>
+      <w:r>
+        <w:t>@(</w:t>
+      </w:r>
+      <w:proofErr w:type="gramEnd"/>
+      <w:r>
+        <w:t xml:space="preserve">() =&gt; </w:t>
+      </w:r>
+      <w:proofErr w:type="spellStart"/>
+      <w:r>
+        <w:t>EditBudgetAsync</w:t>
+      </w:r>
+      <w:proofErr w:type="spellEnd"/>
+      <w:r>
+        <w:t>(</w:t>
+      </w:r>
+      <w:proofErr w:type="spellStart"/>
+      <w:proofErr w:type="gramStart"/>
+      <w:r>
+        <w:t>row.Item</w:t>
+      </w:r>
+      <w:proofErr w:type="spellEnd"/>
+      <w:proofErr w:type="gramEnd"/>
+      <w:r>
+        <w:t>))"&gt;</w:t>
+      </w:r>
+    </w:p>
+    <w:p>
+      <w:pPr>
+        <w:spacing w:after="0"/>
+      </w:pPr>
+      <w:r>
+        <w:t xml:space="preserve">                    &lt;/</w:t>
+      </w:r>
+      <w:proofErr w:type="spellStart"/>
+      <w:r>
+        <w:t>MudIconButton</w:t>
+      </w:r>
+      <w:proofErr w:type="spellEnd"/>
+      <w:r>
+        <w:t>&gt;</w:t>
+      </w:r>
+    </w:p>
+    <w:p>
+      <w:pPr>
+        <w:spacing w:after="0"/>
+      </w:pPr>
+      <w:r>
+        <w:t xml:space="preserve">                    &lt;</w:t>
+      </w:r>
+      <w:proofErr w:type="spellStart"/>
+      <w:r>
+        <w:t>MudIconButton</w:t>
+      </w:r>
+      <w:proofErr w:type="spellEnd"/>
+      <w:r>
+        <w:t xml:space="preserve"> Color="</w:t>
+      </w:r>
+      <w:proofErr w:type="spellStart"/>
+      <w:r>
+        <w:t>Color.Tertiary</w:t>
+      </w:r>
+      <w:proofErr w:type="spellEnd"/>
+      <w:r>
+        <w:t>" title="Create requisition"</w:t>
+      </w:r>
+    </w:p>
+    <w:p>
+      <w:pPr>
+        <w:spacing w:after="0"/>
+      </w:pPr>
+      <w:r>
+        <w:t xml:space="preserve">                        Icon="@</w:t>
+      </w:r>
+      <w:proofErr w:type="spellStart"/>
+      <w:proofErr w:type="gramStart"/>
+      <w:r>
+        <w:t>Icons.Material.Rounded.CreateNewFolder</w:t>
+      </w:r>
+      <w:proofErr w:type="spellEnd"/>
+      <w:proofErr w:type="gramEnd"/>
+      <w:r>
+        <w:t>"</w:t>
+      </w:r>
+    </w:p>
+    <w:p>
+      <w:pPr>
+        <w:spacing w:after="0"/>
+      </w:pPr>
+      <w:r>
+        <w:t xml:space="preserve">                        Disabled="</w:t>
+      </w:r>
+      <w:proofErr w:type="gramStart"/>
+      <w:r>
+        <w:t>@(</w:t>
+      </w:r>
+      <w:proofErr w:type="spellStart"/>
+      <w:r>
+        <w:t>row.Item.NewIndentCount</w:t>
+      </w:r>
+      <w:proofErr w:type="spellEnd"/>
+      <w:proofErr w:type="gramEnd"/>
+      <w:r>
+        <w:t xml:space="preserve"> == 0)"</w:t>
+      </w:r>
+    </w:p>
+    <w:p>
+      <w:pPr>
+        <w:spacing w:after="0"/>
+      </w:pPr>
+      <w:r>
+        <w:t xml:space="preserve">                        </w:t>
+      </w:r>
+      <w:proofErr w:type="spellStart"/>
+      <w:r>
+        <w:t>OnClick</w:t>
+      </w:r>
+      <w:proofErr w:type="spellEnd"/>
+      <w:r>
+        <w:t>="@(</w:t>
+      </w:r>
+      <w:proofErr w:type="gramStart"/>
+      <w:r>
+        <w:t>()=</w:t>
+      </w:r>
+      <w:proofErr w:type="gramEnd"/>
+      <w:r>
+        <w:t>&gt;</w:t>
+      </w:r>
+      <w:proofErr w:type="spellStart"/>
+      <w:r>
+        <w:t>AddRequisition</w:t>
+      </w:r>
+      <w:proofErr w:type="spellEnd"/>
+      <w:r>
+        <w:t>(</w:t>
+      </w:r>
+      <w:proofErr w:type="spellStart"/>
+      <w:proofErr w:type="gramStart"/>
+      <w:r>
+        <w:t>row.Item</w:t>
+      </w:r>
+      <w:proofErr w:type="spellEnd"/>
+      <w:proofErr w:type="gramEnd"/>
+      <w:r>
+        <w:t>))"&gt;</w:t>
+      </w:r>
+    </w:p>
+    <w:p>
+      <w:pPr>
+        <w:spacing w:after="0"/>
+      </w:pPr>
+      <w:r>
+        <w:t xml:space="preserve">                    &lt;/</w:t>
+      </w:r>
+      <w:proofErr w:type="spellStart"/>
+      <w:r>
+        <w:t>MudIconButton</w:t>
+      </w:r>
+      <w:proofErr w:type="spellEnd"/>
+      <w:r>
+        <w:t>&gt;</w:t>
+      </w:r>
+    </w:p>
+    <w:p>
+      <w:pPr>
+        <w:spacing w:after="0"/>
+      </w:pPr>
+      <w:r>
+        <w:t xml:space="preserve">                    &lt;</w:t>
+      </w:r>
+      <w:proofErr w:type="spellStart"/>
+      <w:r>
+        <w:t>MudIconButton</w:t>
+      </w:r>
+      <w:proofErr w:type="spellEnd"/>
+      <w:r>
+        <w:t xml:space="preserve"> Color="</w:t>
+      </w:r>
+      <w:proofErr w:type="spellStart"/>
+      <w:r>
+        <w:t>Color.Error</w:t>
+      </w:r>
+      <w:proofErr w:type="spellEnd"/>
+      <w:r>
+        <w:t>" title="Delete budget record"</w:t>
+      </w:r>
+    </w:p>
+    <w:p>
+      <w:pPr>
+        <w:spacing w:after="0"/>
+      </w:pPr>
+      <w:r>
+        <w:t xml:space="preserve">                                    Icon="@</w:t>
+      </w:r>
+      <w:proofErr w:type="spellStart"/>
+      <w:proofErr w:type="gramStart"/>
+      <w:r>
+        <w:t>Icons.Material.Rounded.DeleteForever</w:t>
+      </w:r>
+      <w:proofErr w:type="spellEnd"/>
+      <w:proofErr w:type="gramEnd"/>
+      <w:r>
+        <w:t>"</w:t>
+      </w:r>
+    </w:p>
+    <w:p>
+      <w:pPr>
+        <w:spacing w:after="0"/>
+      </w:pPr>
+      <w:r>
+        <w:t xml:space="preserve">                        </w:t>
+      </w:r>
+      <w:proofErr w:type="spellStart"/>
+      <w:r>
+        <w:t>OnClick</w:t>
+      </w:r>
+      <w:proofErr w:type="spellEnd"/>
+      <w:r>
+        <w:t xml:space="preserve">="() =&gt; </w:t>
+      </w:r>
+      <w:proofErr w:type="spellStart"/>
+      <w:r>
+        <w:t>ConfirmDeleteBudget</w:t>
+      </w:r>
+      <w:proofErr w:type="spellEnd"/>
+      <w:r>
+        <w:t>(</w:t>
+      </w:r>
+      <w:proofErr w:type="spellStart"/>
+      <w:proofErr w:type="gramStart"/>
+      <w:r>
+        <w:t>row.Item</w:t>
+      </w:r>
+      <w:proofErr w:type="spellEnd"/>
+      <w:proofErr w:type="gramEnd"/>
+      <w:r>
+        <w:t>)"&gt;</w:t>
+      </w:r>
+    </w:p>
+    <w:p>
+      <w:pPr>
+        <w:spacing w:after="0"/>
+      </w:pPr>
+      <w:r>
+        <w:t xml:space="preserve">                    &lt;/</w:t>
+      </w:r>
+      <w:proofErr w:type="spellStart"/>
+      <w:r>
+        <w:t>MudIconButton</w:t>
+      </w:r>
+      <w:proofErr w:type="spellEnd"/>
+      <w:r>
+        <w:t>&gt;</w:t>
+      </w:r>
+    </w:p>
+    <w:p>
+      <w:pPr>
+        <w:spacing w:after="0"/>
+      </w:pPr>
+      <w:r>
+        <w:t xml:space="preserve">                &lt;/</w:t>
+      </w:r>
+      <w:proofErr w:type="spellStart"/>
+      <w:r>
+        <w:t>CellTemplate</w:t>
+      </w:r>
+      <w:proofErr w:type="spellEnd"/>
+      <w:r>
+        <w:t>&gt;</w:t>
+      </w:r>
+    </w:p>
+    <w:p>
+      <w:pPr>
+        <w:spacing w:after="0"/>
+      </w:pPr>
+      <w:r>
+        <w:t xml:space="preserve">            &lt;/</w:t>
+      </w:r>
+      <w:proofErr w:type="spellStart"/>
+      <w:r>
+        <w:t>TemplateColumn</w:t>
+      </w:r>
+      <w:proofErr w:type="spellEnd"/>
+      <w:r>
+        <w:t>&gt; *@</w:t>
+      </w:r>
+    </w:p>
+    <w:p>
+      <w:pPr>
+        <w:spacing w:after="0"/>
+      </w:pPr>
+      <w:r>
+        <w:t xml:space="preserve">            &lt;</w:t>
+      </w:r>
+      <w:proofErr w:type="spellStart"/>
+      <w:r>
+        <w:t>TemplateColumn</w:t>
+      </w:r>
+      <w:proofErr w:type="spellEnd"/>
+      <w:r>
+        <w:t xml:space="preserve"> </w:t>
+      </w:r>
+      <w:proofErr w:type="spellStart"/>
+      <w:r>
+        <w:t>CellClass</w:t>
+      </w:r>
+      <w:proofErr w:type="spellEnd"/>
+      <w:r>
+        <w:t>="d-flex justify-end" Title="Actions"&gt;</w:t>
+      </w:r>
+    </w:p>
+    <w:p>
+      <w:pPr>
+        <w:spacing w:after="0"/>
+      </w:pPr>
+      <w:r>
+        <w:t xml:space="preserve">                &lt;</w:t>
+      </w:r>
+      <w:proofErr w:type="spellStart"/>
+      <w:r>
+        <w:t>CellTemplate</w:t>
+      </w:r>
+      <w:proofErr w:type="spellEnd"/>
+      <w:r>
+        <w:t xml:space="preserve"> Context="row"&gt;</w:t>
+      </w:r>
+    </w:p>
+    <w:p>
+      <w:pPr>
+        <w:spacing w:after="0"/>
+      </w:pPr>
+      <w:r>
+        <w:t xml:space="preserve">                    &lt;</w:t>
+      </w:r>
+      <w:proofErr w:type="spellStart"/>
+      <w:r>
+        <w:t>MudIconButton</w:t>
+      </w:r>
+      <w:proofErr w:type="spellEnd"/>
+      <w:r>
+        <w:t xml:space="preserve"> title="Create requisition" </w:t>
+      </w:r>
+    </w:p>
+    <w:p>
+      <w:pPr>
+        <w:spacing w:after="0"/>
+      </w:pPr>
+      <w:r>
+        <w:t xml:space="preserve">                        Class="show-</w:t>
+      </w:r>
+      <w:proofErr w:type="spellStart"/>
+      <w:r>
+        <w:t>btn</w:t>
+      </w:r>
+      <w:proofErr w:type="spellEnd"/>
+      <w:r>
+        <w:t xml:space="preserve"> fa-icon-</w:t>
+      </w:r>
+      <w:proofErr w:type="spellStart"/>
+      <w:r>
+        <w:t>btn</w:t>
+      </w:r>
+      <w:proofErr w:type="spellEnd"/>
+      <w:r>
+        <w:t>"</w:t>
+      </w:r>
+    </w:p>
+    <w:p>
+      <w:pPr>
+        <w:spacing w:after="0"/>
+      </w:pPr>
+      <w:r>
+        <w:t xml:space="preserve">                        Color="</w:t>
+      </w:r>
+      <w:proofErr w:type="spellStart"/>
+      <w:r>
+        <w:t>Color.Surface</w:t>
+      </w:r>
+      <w:proofErr w:type="spellEnd"/>
+      <w:r>
+        <w:t>"</w:t>
+      </w:r>
+    </w:p>
+    <w:p>
+      <w:pPr>
+        <w:spacing w:after="0"/>
+      </w:pPr>
+      <w:r>
+        <w:t xml:space="preserve">                        </w:t>
+      </w:r>
+      <w:proofErr w:type="spellStart"/>
+      <w:r>
+        <w:t>OnClick</w:t>
+      </w:r>
+      <w:proofErr w:type="spellEnd"/>
+      <w:r>
+        <w:t>="@(</w:t>
+      </w:r>
+      <w:proofErr w:type="gramStart"/>
+      <w:r>
+        <w:t>()=</w:t>
+      </w:r>
+      <w:proofErr w:type="gramEnd"/>
+      <w:r>
+        <w:t>&gt;</w:t>
+      </w:r>
+      <w:proofErr w:type="spellStart"/>
+      <w:r>
+        <w:t>AddRequisition</w:t>
+      </w:r>
+      <w:proofErr w:type="spellEnd"/>
+      <w:r>
+        <w:t>(</w:t>
+      </w:r>
+      <w:proofErr w:type="spellStart"/>
+      <w:proofErr w:type="gramStart"/>
+      <w:r>
+        <w:t>row.Item</w:t>
+      </w:r>
+      <w:proofErr w:type="spellEnd"/>
+      <w:proofErr w:type="gramEnd"/>
+      <w:r>
+        <w:t>))"&gt;</w:t>
+      </w:r>
+    </w:p>
+    <w:p>
+      <w:pPr>
+        <w:spacing w:after="0"/>
+      </w:pPr>
+      <w:r>
+        <w:t xml:space="preserve">                        &lt;</w:t>
+      </w:r>
+      <w:proofErr w:type="spellStart"/>
+      <w:r>
+        <w:t>ChildContent</w:t>
+      </w:r>
+      <w:proofErr w:type="spellEnd"/>
+      <w:r>
+        <w:t>&gt;</w:t>
+      </w:r>
+    </w:p>
+    <w:p>
+      <w:pPr>
+        <w:spacing w:after="0"/>
+      </w:pPr>
+      <w:r>
+        <w:t xml:space="preserve">                            &lt;</w:t>
+      </w:r>
+      <w:proofErr w:type="spellStart"/>
+      <w:r>
+        <w:t>i</w:t>
+      </w:r>
+      <w:proofErr w:type="spellEnd"/>
+      <w:r>
+        <w:t xml:space="preserve"> class="</w:t>
+      </w:r>
+      <w:proofErr w:type="spellStart"/>
+      <w:r>
+        <w:t>fas</w:t>
+      </w:r>
+      <w:proofErr w:type="spellEnd"/>
+      <w:r>
+        <w:t xml:space="preserve"> fa-plus-circle fa-1x"&gt;&lt;/</w:t>
+      </w:r>
+      <w:proofErr w:type="spellStart"/>
+      <w:r>
+        <w:t>i</w:t>
+      </w:r>
+      <w:proofErr w:type="spellEnd"/>
+      <w:r>
+        <w:t>&gt;</w:t>
+      </w:r>
+    </w:p>
+    <w:p>
+      <w:pPr>
+        <w:spacing w:after="0"/>
+      </w:pPr>
+      <w:r>
+        <w:t xml:space="preserve">                        &lt;/</w:t>
+      </w:r>
+      <w:proofErr w:type="spellStart"/>
+      <w:r>
+        <w:t>ChildContent</w:t>
+      </w:r>
+      <w:proofErr w:type="spellEnd"/>
+      <w:r>
+        <w:t>&gt;</w:t>
+      </w:r>
+    </w:p>
+    <w:p>
+      <w:pPr>
+        <w:spacing w:after="0"/>
+      </w:pPr>
+      <w:r>
+        <w:t xml:space="preserve">                    &lt;/</w:t>
+      </w:r>
+      <w:proofErr w:type="spellStart"/>
+      <w:r>
+        <w:t>MudIconButton</w:t>
+      </w:r>
+      <w:proofErr w:type="spellEnd"/>
+      <w:r>
+        <w:t>&gt;</w:t>
+      </w:r>
+    </w:p>
+    <w:p>
+      <w:pPr>
+        <w:spacing w:after="0"/>
+      </w:pPr>
+      <w:r>
+        <w:t xml:space="preserve">                    &lt;</w:t>
+      </w:r>
+      <w:proofErr w:type="spellStart"/>
+      <w:r>
+        <w:t>MudIconButton</w:t>
+      </w:r>
+      <w:proofErr w:type="spellEnd"/>
+      <w:r>
+        <w:t xml:space="preserve"> title="Edit budget details" </w:t>
+      </w:r>
+    </w:p>
+    <w:p>
+      <w:pPr>
+        <w:spacing w:after="0"/>
+      </w:pPr>
+      <w:r>
+        <w:t xml:space="preserve">                        Class="show-</w:t>
+      </w:r>
+      <w:proofErr w:type="spellStart"/>
+      <w:r>
+        <w:t>btn</w:t>
+      </w:r>
+      <w:proofErr w:type="spellEnd"/>
+      <w:r>
+        <w:t xml:space="preserve"> fa-icon-</w:t>
+      </w:r>
+      <w:proofErr w:type="spellStart"/>
+      <w:r>
+        <w:t>btn</w:t>
+      </w:r>
+      <w:proofErr w:type="spellEnd"/>
+      <w:r>
+        <w:t>"</w:t>
+      </w:r>
+    </w:p>
+    <w:p>
+      <w:pPr>
+        <w:spacing w:after="0"/>
+      </w:pPr>
+      <w:r>
+        <w:t xml:space="preserve">                        Color="</w:t>
+      </w:r>
+      <w:proofErr w:type="spellStart"/>
+      <w:r>
+        <w:t>Color.Surface</w:t>
+      </w:r>
+      <w:proofErr w:type="spellEnd"/>
+      <w:r>
+        <w:t>"</w:t>
+      </w:r>
+    </w:p>
+    <w:p>
+      <w:pPr>
+        <w:spacing w:after="0"/>
+      </w:pPr>
+      <w:r>
+        <w:t xml:space="preserve">                        </w:t>
+      </w:r>
+      <w:proofErr w:type="spellStart"/>
+      <w:r>
+        <w:t>OnClick</w:t>
+      </w:r>
+      <w:proofErr w:type="spellEnd"/>
+      <w:r>
+        <w:t>="</w:t>
+      </w:r>
+      <w:proofErr w:type="gramStart"/>
+      <w:r>
+        <w:t>@(</w:t>
+      </w:r>
+      <w:proofErr w:type="gramEnd"/>
+      <w:r>
+        <w:t xml:space="preserve">() =&gt; </w:t>
+      </w:r>
+      <w:proofErr w:type="spellStart"/>
+      <w:r>
+        <w:t>EditBudgetAsync</w:t>
+      </w:r>
+      <w:proofErr w:type="spellEnd"/>
+      <w:r>
+        <w:t>(</w:t>
+      </w:r>
+      <w:proofErr w:type="spellStart"/>
+      <w:proofErr w:type="gramStart"/>
+      <w:r>
+        <w:t>row.Item</w:t>
+      </w:r>
+      <w:proofErr w:type="spellEnd"/>
+      <w:proofErr w:type="gramEnd"/>
+      <w:r>
+        <w:t>))"&gt;</w:t>
+      </w:r>
+    </w:p>
+    <w:p>
+      <w:pPr>
+        <w:spacing w:after="0"/>
+      </w:pPr>
+      <w:r>
+        <w:t xml:space="preserve">                        &lt;</w:t>
+      </w:r>
+      <w:proofErr w:type="spellStart"/>
+      <w:r>
+        <w:t>ChildContent</w:t>
+      </w:r>
+      <w:proofErr w:type="spellEnd"/>
+      <w:r>
+        <w:t>&gt;</w:t>
+      </w:r>
+    </w:p>
+    <w:p>
+      <w:pPr>
+        <w:spacing w:after="0"/>
+      </w:pPr>
+      <w:r>
+        <w:lastRenderedPageBreak/>
+        <w:t xml:space="preserve">                            &lt;</w:t>
+      </w:r>
+      <w:proofErr w:type="spellStart"/>
+      <w:r>
+        <w:t>i</w:t>
+      </w:r>
+      <w:proofErr w:type="spellEnd"/>
+      <w:r>
+        <w:t xml:space="preserve"> class="</w:t>
+      </w:r>
+      <w:proofErr w:type="spellStart"/>
+      <w:r>
+        <w:t>fas</w:t>
+      </w:r>
+      <w:proofErr w:type="spellEnd"/>
+      <w:r>
+        <w:t xml:space="preserve"> fa-pen-alt fa-1x"&gt;&lt;/</w:t>
+      </w:r>
+      <w:proofErr w:type="spellStart"/>
+      <w:r>
+        <w:t>i</w:t>
+      </w:r>
+      <w:proofErr w:type="spellEnd"/>
+      <w:r>
+        <w:t>&gt;</w:t>
+      </w:r>
+    </w:p>
+    <w:p>
+      <w:pPr>
+        <w:spacing w:after="0"/>
+      </w:pPr>
+      <w:r>
+        <w:t xml:space="preserve">                        &lt;/</w:t>
+      </w:r>
+      <w:proofErr w:type="spellStart"/>
+      <w:r>
+        <w:t>ChildContent</w:t>
+      </w:r>
+      <w:proofErr w:type="spellEnd"/>
+      <w:r>
+        <w:t>&gt;</w:t>
+      </w:r>
+    </w:p>
+    <w:p>
+      <w:pPr>
+        <w:spacing w:after="0"/>
+      </w:pPr>
+      <w:r>
+        <w:t xml:space="preserve">                    &lt;/</w:t>
+      </w:r>
+      <w:proofErr w:type="spellStart"/>
+      <w:r>
+        <w:t>MudIconButton</w:t>
+      </w:r>
+      <w:proofErr w:type="spellEnd"/>
+      <w:r>
+        <w:t>&gt;</w:t>
+      </w:r>
+    </w:p>
+    <w:p>
+      <w:pPr>
+        <w:spacing w:after="0"/>
+      </w:pPr>
+      <w:r>
+        <w:t xml:space="preserve">                    &lt;</w:t>
+      </w:r>
+      <w:proofErr w:type="spellStart"/>
+      <w:r>
+        <w:t>MudIconButton</w:t>
+      </w:r>
+      <w:proofErr w:type="spellEnd"/>
+      <w:r>
+        <w:t xml:space="preserve"> title="Delete budget record" </w:t>
+      </w:r>
+    </w:p>
+    <w:p>
+      <w:pPr>
+        <w:spacing w:after="0"/>
+      </w:pPr>
+      <w:r>
+        <w:t xml:space="preserve">                        Class="fa-icon-</w:t>
+      </w:r>
+      <w:proofErr w:type="spellStart"/>
+      <w:r>
+        <w:t>btn</w:t>
+      </w:r>
+      <w:proofErr w:type="spellEnd"/>
+      <w:r>
+        <w:t xml:space="preserve">" </w:t>
+      </w:r>
+    </w:p>
+    <w:p>
+      <w:pPr>
+        <w:spacing w:after="0"/>
+      </w:pPr>
+      <w:r>
+        <w:t xml:space="preserve">                        Color="</w:t>
+      </w:r>
+      <w:proofErr w:type="spellStart"/>
+      <w:r>
+        <w:t>Color.Error</w:t>
+      </w:r>
+      <w:proofErr w:type="spellEnd"/>
+      <w:r>
+        <w:t>"</w:t>
+      </w:r>
+    </w:p>
+    <w:p>
+      <w:pPr>
+        <w:spacing w:after="0"/>
+      </w:pPr>
+      <w:r>
+        <w:t xml:space="preserve">                        </w:t>
+      </w:r>
+      <w:proofErr w:type="spellStart"/>
+      <w:r>
+        <w:t>OnClick</w:t>
+      </w:r>
+      <w:proofErr w:type="spellEnd"/>
+      <w:r>
+        <w:t xml:space="preserve">="() =&gt; </w:t>
+      </w:r>
+      <w:proofErr w:type="spellStart"/>
+      <w:r>
+        <w:t>ConfirmDeleteBudget</w:t>
+      </w:r>
+      <w:proofErr w:type="spellEnd"/>
+      <w:r>
+        <w:t>(</w:t>
+      </w:r>
+      <w:proofErr w:type="spellStart"/>
+      <w:proofErr w:type="gramStart"/>
+      <w:r>
+        <w:t>row.Item</w:t>
+      </w:r>
+      <w:proofErr w:type="spellEnd"/>
+      <w:proofErr w:type="gramEnd"/>
+      <w:r>
+        <w:t>)"&gt;</w:t>
+      </w:r>
+    </w:p>
+    <w:p>
+      <w:pPr>
+        <w:spacing w:after="0"/>
+      </w:pPr>
+      <w:r>
+        <w:t xml:space="preserve">                        &lt;</w:t>
+      </w:r>
+      <w:proofErr w:type="spellStart"/>
+      <w:r>
+        <w:t>ChildContent</w:t>
+      </w:r>
+      <w:proofErr w:type="spellEnd"/>
+      <w:r>
+        <w:t>&gt;</w:t>
+      </w:r>
+    </w:p>
+    <w:p>
+      <w:pPr>
+        <w:spacing w:after="0"/>
+      </w:pPr>
+      <w:r>
+        <w:t xml:space="preserve">                            &lt;</w:t>
+      </w:r>
+      <w:proofErr w:type="spellStart"/>
+      <w:r>
+        <w:t>i</w:t>
+      </w:r>
+      <w:proofErr w:type="spellEnd"/>
+      <w:r>
+        <w:t xml:space="preserve"> class="</w:t>
+      </w:r>
+      <w:proofErr w:type="spellStart"/>
+      <w:r>
+        <w:t>fas</w:t>
+      </w:r>
+      <w:proofErr w:type="spellEnd"/>
+      <w:r>
+        <w:t xml:space="preserve"> fa-trash-alt fa-1x"&gt;&lt;/</w:t>
+      </w:r>
+      <w:proofErr w:type="spellStart"/>
+      <w:r>
+        <w:t>i</w:t>
+      </w:r>
+      <w:proofErr w:type="spellEnd"/>
+      <w:r>
+        <w:t>&gt;</w:t>
+      </w:r>
+    </w:p>
+    <w:p>
+      <w:pPr>
+        <w:spacing w:after="0"/>
+      </w:pPr>
+      <w:r>
+        <w:t xml:space="preserve">                        &lt;/</w:t>
+      </w:r>
+      <w:proofErr w:type="spellStart"/>
+      <w:r>
+        <w:t>ChildContent</w:t>
+      </w:r>
+      <w:proofErr w:type="spellEnd"/>
+      <w:r>
+        <w:t>&gt;</w:t>
+      </w:r>
+    </w:p>
+    <w:p>
+      <w:pPr>
+        <w:spacing w:after="0"/>
+      </w:pPr>
+      <w:r>
+        <w:t xml:space="preserve">                    &lt;/</w:t>
+      </w:r>
+      <w:proofErr w:type="spellStart"/>
+      <w:r>
+        <w:t>MudIconButton</w:t>
+      </w:r>
+      <w:proofErr w:type="spellEnd"/>
+      <w:r>
+        <w:t>&gt;</w:t>
+      </w:r>
+    </w:p>
+    <w:p>
+      <w:pPr>
+        <w:spacing w:after="0"/>
+      </w:pPr>
+      <w:r>
+        <w:t xml:space="preserve">                &lt;/</w:t>
+      </w:r>
+      <w:proofErr w:type="spellStart"/>
+      <w:r>
+        <w:t>CellTemplate</w:t>
+      </w:r>
+      <w:proofErr w:type="spellEnd"/>
+      <w:r>
+        <w:t>&gt;</w:t>
+      </w:r>
+    </w:p>
+    <w:p>
+      <w:pPr>
+        <w:spacing w:after="0"/>
+      </w:pPr>
+      <w:r>
+        <w:t xml:space="preserve">            &lt;/</w:t>
+      </w:r>
+      <w:proofErr w:type="spellStart"/>
+      <w:r>
+        <w:t>TemplateColumn</w:t>
+      </w:r>
+      <w:proofErr w:type="spellEnd"/>
+      <w:r>
+        <w:t>&gt;</w:t>
+      </w:r>
+    </w:p>
+    <w:p>
+      <w:pPr>
+        <w:spacing w:after="0"/>
+      </w:pPr>
+      <w:r>
+        <w:t xml:space="preserve">        &lt;/Columns&gt;</w:t>
+      </w:r>
+    </w:p>
+    <w:p>
+      <w:pPr>
+        <w:spacing w:after="0"/>
+      </w:pPr>
+      <w:r>
+        <w:t xml:space="preserve">        &lt;</w:t>
+      </w:r>
+      <w:proofErr w:type="spellStart"/>
+      <w:r>
+        <w:t>NoRecordsContent</w:t>
+      </w:r>
+      <w:proofErr w:type="spellEnd"/>
+      <w:r>
+        <w:t>&gt;</w:t>
+      </w:r>
+    </w:p>
+    <w:p>
+      <w:pPr>
+        <w:spacing w:after="0"/>
+      </w:pPr>
+      <w:r>
+        <w:t xml:space="preserve">            &lt;div class="no-data-box"&gt;</w:t>
+      </w:r>
+    </w:p>
+    <w:p>
+      <w:pPr>
+        <w:spacing w:after="0"/>
+      </w:pPr>
+      <w:r>
+        <w:t xml:space="preserve">                &lt;</w:t>
+      </w:r>
+      <w:proofErr w:type="spellStart"/>
+      <w:r>
+        <w:t>MudIcon</w:t>
+      </w:r>
+      <w:proofErr w:type="spellEnd"/>
+      <w:r>
+        <w:t xml:space="preserve"> Icon="@</w:t>
+      </w:r>
+      <w:proofErr w:type="spellStart"/>
+      <w:proofErr w:type="gramStart"/>
+      <w:r>
+        <w:t>Icons.Material.Filled.Info</w:t>
+      </w:r>
+      <w:proofErr w:type="spellEnd"/>
+      <w:proofErr w:type="gramEnd"/>
+      <w:r>
+        <w:t>" Class="no-data-icon" /&gt;</w:t>
+      </w:r>
+    </w:p>
+    <w:p>
+      <w:pPr>
+        <w:spacing w:after="0"/>
+      </w:pPr>
+      <w:r>
+        <w:t xml:space="preserve">                &lt;span&gt;No data found&lt;/span&gt;</w:t>
+      </w:r>
+    </w:p>
+    <w:p>
+      <w:pPr>
+        <w:spacing w:after="0"/>
+      </w:pPr>
+      <w:r>
+        <w:t xml:space="preserve">            &lt;/div&gt;</w:t>
+      </w:r>
+    </w:p>
+    <w:p>
+      <w:pPr>
+        <w:spacing w:after="0"/>
+      </w:pPr>
+      <w:r>
+        <w:t xml:space="preserve">        &lt;/</w:t>
+      </w:r>
+      <w:proofErr w:type="spellStart"/>
+      <w:r>
+        <w:t>NoRecordsContent</w:t>
+      </w:r>
+      <w:proofErr w:type="spellEnd"/>
+      <w:r>
+        <w:t>&gt;</w:t>
+      </w:r>
+    </w:p>
+    <w:p>
+      <w:pPr>
+        <w:spacing w:after="0"/>
+      </w:pPr>
+      <w:r>
+        <w:t xml:space="preserve">        &lt;</w:t>
+      </w:r>
+      <w:proofErr w:type="spellStart"/>
+      <w:r>
+        <w:t>PagerContent</w:t>
+      </w:r>
+      <w:proofErr w:type="spellEnd"/>
+      <w:r>
+        <w:t>&gt;</w:t>
+      </w:r>
+    </w:p>
+    <w:p>
+      <w:pPr>
+        <w:spacing w:after="0"/>
+      </w:pPr>
+      <w:r>
+        <w:t xml:space="preserve">            &lt;</w:t>
+      </w:r>
+      <w:proofErr w:type="spellStart"/>
+      <w:r>
+        <w:t>MudDataGridPager</w:t>
+      </w:r>
+      <w:proofErr w:type="spellEnd"/>
+      <w:r>
+        <w:t xml:space="preserve"> T="</w:t>
+      </w:r>
+      <w:proofErr w:type="spellStart"/>
+      <w:r>
+        <w:t>RecruitmentBudgetDTO</w:t>
+      </w:r>
+      <w:proofErr w:type="spellEnd"/>
+      <w:r>
+        <w:t xml:space="preserve">" </w:t>
+      </w:r>
+      <w:proofErr w:type="spellStart"/>
+      <w:r>
+        <w:t>PageSizeOptions</w:t>
+      </w:r>
+      <w:proofErr w:type="spellEnd"/>
+      <w:r>
+        <w:t xml:space="preserve">="new </w:t>
+      </w:r>
+      <w:proofErr w:type="gramStart"/>
+      <w:r>
+        <w:t>int[</w:t>
+      </w:r>
+      <w:proofErr w:type="gramEnd"/>
+      <w:r>
+        <w:t>] {5,10,20,50,100,500}" /&gt;</w:t>
+      </w:r>
+    </w:p>
+    <w:p>
+      <w:pPr>
+        <w:spacing w:after="0"/>
+      </w:pPr>
+      <w:r>
+        <w:t xml:space="preserve">        &lt;/</w:t>
+      </w:r>
+      <w:proofErr w:type="spellStart"/>
+      <w:r>
+        <w:t>PagerContent</w:t>
+      </w:r>
+      <w:proofErr w:type="spellEnd"/>
+      <w:r>
+        <w:t>&gt;</w:t>
+      </w:r>
+    </w:p>
+    <w:p>
+      <w:pPr>
+        <w:spacing w:after="0"/>
+      </w:pPr>
+      <w:r>
+        <w:t xml:space="preserve">    &lt;/</w:t>
+      </w:r>
+      <w:proofErr w:type="spellStart"/>
+      <w:r>
+        <w:t>MudDataGrid</w:t>
+      </w:r>
+      <w:proofErr w:type="spellEnd"/>
+      <w:r>
+        <w:t>&gt;</w:t>
+      </w:r>
+    </w:p>
+    <w:p>
+      <w:pPr>
+        <w:spacing w:after="0"/>
+      </w:pPr>
+      <w:r>
+        <w:t>&lt;/</w:t>
+      </w:r>
+      <w:proofErr w:type="spellStart"/>
+      <w:r>
+        <w:t>MudPaper</w:t>
+      </w:r>
+      <w:proofErr w:type="spellEnd"/>
+      <w:r>
+        <w:t>&gt;</w:t>
+      </w:r>
+    </w:p>
+    <w:p>
+      <w:pPr>
+        <w:spacing w:after="0"/>
+      </w:pPr>
+    </w:p>
+    <w:p>
+      <w:pPr>
+        <w:spacing w:after="0"/>
+        <w:rPr>
+          <w:b/>
+          <w:bCs/>
+          <w:color w:val="EE0000"/>
+          <w:u w:val="single"/>
+        </w:rPr>
+      </w:pPr>
+      <w:r>
+        <w:rPr>
+          <w:b/>
+          <w:bCs/>
+          <w:color w:val="EE0000"/>
+          <w:u w:val="single"/>
+        </w:rPr>
+        <w:t>Prompt #5:</w:t>
+      </w:r>
+    </w:p>
+    <w:p>
+      <w:pPr>
+        <w:spacing w:after="0"/>
+      </w:pPr>
+    </w:p>
+    <w:p>
+      <w:pPr>
+        <w:spacing w:after="0"/>
+      </w:pPr>
+      <w:r>
+        <w:t>Tell me how to write the below CSS to Blazor page and not using a separate CSS file.</w:t>
+      </w:r>
+    </w:p>
+    <w:p>
+      <w:pPr>
+        <w:spacing w:after="0"/>
+      </w:pPr>
+      <w:proofErr w:type="gramStart"/>
+      <w:r>
+        <w:t>.action</w:t>
+      </w:r>
+      <w:proofErr w:type="gramEnd"/>
+      <w:r>
+        <w:t>-buttons {</w:t>
+      </w:r>
+      <w:r>
+        <w:br/>
+        <w:t>display: flex;</w:t>
+      </w:r>
+      <w:r>
+        <w:br/>
+        <w:t>justify-content: center;</w:t>
+      </w:r>
+      <w:r>
+        <w:br/>
+        <w:t>align-items: center;</w:t>
+      </w:r>
+      <w:r>
+        <w:br/>
+        <w:t>gap: 4px;</w:t>
+      </w:r>
+      <w:r>
+        <w:br/>
+        <w:t>height: 100%;</w:t>
+      </w:r>
+      <w:r>
+        <w:br/>
+        <w:t>}</w:t>
+      </w:r>
+    </w:p>
+    <w:p/>
     <w:sectPr>
       <w:pgSz w:w="12240" w:h="15840"/>
       <w:pgMar w:top="1440" w:right="1080" w:bottom="1440" w:left="1080" w:header="720" w:footer="720" w:gutter="0"/>
@@ -3819,7 +8344,6 @@
   <w:style w:type="character" w:default="1" w:styleId="DefaultParagraphFont">
     <w:name w:val="Default Paragraph Font"/>
     <w:uiPriority w:val="1"/>
-    <w:semiHidden/>
     <w:unhideWhenUsed/>
   </w:style>
   <w:style w:type="table" w:default="1" w:styleId="TableNormal">

</xml_diff>